<commit_message>
Standardize Word exam with BTPro leading tabs, 2-row header table, and save 2 template standards
</commit_message>
<xml_diff>
--- a/pdf2word/San_Pham/De_Thi_2009.docx
+++ b/pdf2word/San_Pham/De_Thi_2009.docx
@@ -8,28 +8,27 @@
         <w:jc w:val="center"/>
         <w:tblLook w:firstColumn="1" w:firstRow="1" w:lastColumn="0" w:lastRow="0" w:noHBand="0" w:noVBand="1" w:val="04A0"/>
         <w:tblBorders>
-          <w:top w:val="single" w:sz="12" w:space="0" w:color="1F497D"/>
-          <w:left w:val="single" w:sz="12" w:space="0" w:color="1F497D"/>
-          <w:bottom w:val="single" w:sz="12" w:space="0" w:color="1F497D"/>
-          <w:right w:val="single" w:sz="12" w:space="0" w:color="1F497D"/>
-          <w:insideH w:val="none"/>
-          <w:insideV w:val="single" w:sz="6" w:space="0" w:color="1F497D"/>
+          <w:top w:val="single" w:sz="8" w:space="0" w:color="000000"/>
+          <w:left w:val="single" w:sz="8" w:space="0" w:color="000000"/>
+          <w:bottom w:val="single" w:sz="8" w:space="0" w:color="000000"/>
+          <w:right w:val="single" w:sz="8" w:space="0" w:color="000000"/>
+          <w:insideH w:val="single" w:sz="6" w:space="0" w:color="000000"/>
+          <w:insideV w:val="single" w:sz="6" w:space="0" w:color="000000"/>
         </w:tblBorders>
       </w:tblPr>
       <w:tblGrid>
-        <w:gridCol w:w="4961"/>
-        <w:gridCol w:w="4961"/>
+        <w:gridCol w:w="3307"/>
+        <w:gridCol w:w="3307"/>
+        <w:gridCol w:w="3307"/>
       </w:tblGrid>
       <w:tr>
         <w:tc>
           <w:tcPr>
-            <w:tcW w:type="dxa" w:w="4876"/>
-            <w:vAlign w:val="center"/>
-            <w:shd w:fill="F4F7FA"/>
+            <w:tcW w:type="dxa" w:w="5386"/>
           </w:tcPr>
           <w:p>
             <w:pPr>
-              <w:spacing w:line="276" w:lineRule="auto" w:before="60" w:after="40"/>
+              <w:spacing w:line="276" w:lineRule="auto" w:before="40" w:after="40"/>
               <w:jc w:val="center"/>
             </w:pPr>
             <w:r>
@@ -46,33 +45,23 @@
             <w:r>
               <w:rPr>
                 <w:rFonts w:ascii="Times New Roman" w:hAnsi="Times New Roman"/>
-                <w:b/>
                 <w:sz w:val="24"/>
                 <w:rFonts w:ascii="Times New Roman" w:hAnsi="Times New Roman" w:cs="Times New Roman"/>
               </w:rPr>
-              <w:t>SĐT: 0935.322.328</w:t>
+              <w:t>SĐT: 0935.322.328  •  50/2C Phạm Thị Liên</w:t>
               <w:br/>
-            </w:r>
-            <w:r>
-              <w:rPr>
-                <w:rFonts w:ascii="Times New Roman" w:hAnsi="Times New Roman"/>
-                <w:b/>
-                <w:sz w:val="24"/>
-                <w:rFonts w:ascii="Times New Roman" w:hAnsi="Times New Roman" w:cs="Times New Roman"/>
-              </w:rPr>
-              <w:t>Đ/c: 50/2C Phạm Thị Liên</w:t>
+              <w:t>--------------------</w:t>
             </w:r>
           </w:p>
         </w:tc>
         <w:tc>
           <w:tcPr>
-            <w:tcW w:type="dxa" w:w="5046"/>
-            <w:vAlign w:val="center"/>
-            <w:shd w:fill="F4F7FA"/>
+            <w:tcW w:type="dxa" w:w="4535"/>
+            <w:gridSpan w:val="2"/>
           </w:tcPr>
           <w:p>
             <w:pPr>
-              <w:spacing w:line="276" w:lineRule="auto" w:before="60" w:after="40"/>
+              <w:spacing w:line="276" w:lineRule="auto" w:before="40" w:after="40"/>
               <w:jc w:val="center"/>
             </w:pPr>
             <w:r>
@@ -82,10 +71,70 @@
                 <w:color w:val="C00000"/>
                 <w:sz w:val="24"/>
                 <w:rFonts w:ascii="Times New Roman" w:hAnsi="Times New Roman" w:cs="Times New Roman"/>
-              </w:rPr>
-              <w:t>ĐỀ ÔN TẬP TOÁN</w:t>
+                <w:rFonts w:ascii="Times New Roman" w:hAnsi="Times New Roman" w:cs="Times New Roman"/>
+              </w:rPr>
+              <w:t>ĐỀ ÔN TẬP TOÁN -- KHỐI LỚP: 12</w:t>
               <w:br/>
             </w:r>
+            <w:r>
+              <w:rPr>
+                <w:rFonts w:ascii="Times New Roman" w:hAnsi="Times New Roman"/>
+                <w:i/>
+                <w:sz w:val="24"/>
+                <w:rFonts w:ascii="Times New Roman" w:hAnsi="Times New Roman" w:cs="Times New Roman"/>
+                <w:rFonts w:ascii="Times New Roman" w:hAnsi="Times New Roman" w:cs="Times New Roman"/>
+              </w:rPr>
+              <w:t>Thời gian làm bài: 90 phút (không kể phát đề)</w:t>
+            </w:r>
+          </w:p>
+        </w:tc>
+      </w:tr>
+      <w:tr>
+        <w:tc>
+          <w:tcPr>
+            <w:tcW w:type="dxa" w:w="5953"/>
+          </w:tcPr>
+          <w:p>
+            <w:pPr>
+              <w:spacing w:before="40" w:after="40"/>
+            </w:pPr>
+            <w:r>
+              <w:rPr>
+                <w:rFonts w:ascii="Times New Roman" w:hAnsi="Times New Roman"/>
+                <w:sz w:val="24"/>
+                <w:rFonts w:ascii="Times New Roman" w:hAnsi="Times New Roman" w:cs="Times New Roman"/>
+              </w:rPr>
+              <w:t>Họ và tên: ............................................................................</w:t>
+            </w:r>
+          </w:p>
+        </w:tc>
+        <w:tc>
+          <w:tcPr>
+            <w:tcW w:type="dxa" w:w="2268"/>
+          </w:tcPr>
+          <w:p>
+            <w:pPr>
+              <w:spacing w:before="40" w:after="40"/>
+            </w:pPr>
+            <w:r>
+              <w:rPr>
+                <w:rFonts w:ascii="Times New Roman" w:hAnsi="Times New Roman"/>
+                <w:sz w:val="24"/>
+                <w:rFonts w:ascii="Times New Roman" w:hAnsi="Times New Roman" w:cs="Times New Roman"/>
+              </w:rPr>
+              <w:t>Số báo danh: .......</w:t>
+            </w:r>
+          </w:p>
+        </w:tc>
+        <w:tc>
+          <w:tcPr>
+            <w:tcW w:type="dxa" w:w="1701"/>
+          </w:tcPr>
+          <w:p>
+            <w:pPr>
+              <w:spacing w:before="40" w:after="40"/>
+              <w:jc w:val="center"/>
+            </w:pPr>
             <w:r>
               <w:rPr>
                 <w:rFonts w:ascii="Times New Roman" w:hAnsi="Times New Roman"/>
@@ -93,17 +142,7 @@
                 <w:sz w:val="24"/>
                 <w:rFonts w:ascii="Times New Roman" w:hAnsi="Times New Roman" w:cs="Times New Roman"/>
               </w:rPr>
-              <w:t>MÔN: TOÁN – KHỐI LỚP: 12</w:t>
-              <w:br/>
-            </w:r>
-            <w:r>
-              <w:rPr>
-                <w:rFonts w:ascii="Times New Roman" w:hAnsi="Times New Roman"/>
-                <w:i/>
-                <w:sz w:val="24"/>
-                <w:rFonts w:ascii="Times New Roman" w:hAnsi="Times New Roman" w:cs="Times New Roman"/>
-              </w:rPr>
-              <w:t>Thời gian làm bài: 90 phút (không kể phát đề)</w:t>
+              <w:t>Mã đề 2009</w:t>
             </w:r>
           </w:p>
         </w:tc>
@@ -111,41 +150,18 @@
     </w:tbl>
     <w:p>
       <w:pPr>
-        <w:spacing w:before="80" w:after="120"/>
-        <w:jc w:val="right"/>
+        <w:spacing w:before="160" w:after="40"/>
+        <w:jc w:val="both"/>
       </w:pPr>
       <w:r>
         <w:rPr>
           <w:rFonts w:ascii="Times New Roman" w:hAnsi="Times New Roman"/>
           <w:b/>
           <w:sz w:val="24"/>
-          <w:bdr w:val="single" w:sz="8" w:space="3" w:color="000000"/>
-          <w:rFonts w:ascii="Times New Roman" w:hAnsi="Times New Roman" w:cs="Times New Roman"/>
-        </w:rPr>
-        <w:t xml:space="preserve">  MÃ ĐỀ THI 2009  </w:t>
-      </w:r>
-    </w:p>
-    <w:p>
-      <w:pPr>
-        <w:spacing w:before="160" w:after="40"/>
-      </w:pPr>
-      <w:r>
-        <w:rPr>
-          <w:rFonts w:ascii="Times New Roman" w:hAnsi="Times New Roman"/>
-          <w:b/>
-          <w:color w:val="0050A0"/>
-          <w:sz w:val="24"/>
-          <w:bdr w:val="single" w:sz="8" w:space="3" w:color="0050A0"/>
-          <w:shd w:fill="EDF3F8"/>
-          <w:rFonts w:ascii="Times New Roman" w:hAnsi="Times New Roman" w:cs="Times New Roman"/>
-        </w:rPr>
-        <w:t xml:space="preserve">  PHẦN 1. Câu trắc nghiệm 4 phương án  </w:t>
-      </w:r>
-    </w:p>
-    <w:p>
-      <w:pPr>
-        <w:spacing w:before="0" w:after="80"/>
-      </w:pPr>
+          <w:rFonts w:ascii="Times New Roman" w:hAnsi="Times New Roman" w:cs="Times New Roman"/>
+        </w:rPr>
+        <w:t>PHẦN I. Câu trắc nghiệm nhiều phương án lựa chọn.</w:t>
+      </w:r>
       <w:r>
         <w:rPr>
           <w:rFonts w:ascii="Times New Roman" w:hAnsi="Times New Roman"/>
@@ -153,7 +169,7 @@
           <w:sz w:val="24"/>
           <w:rFonts w:ascii="Times New Roman" w:hAnsi="Times New Roman" w:cs="Times New Roman"/>
         </w:rPr>
-        <w:t>Thí sinh trả lời từ câu 1 đến câu 12. Mỗi câu hỏi thí sinh chỉ chọn một phương án.</w:t>
+        <w:t xml:space="preserve"> Thí sinh trả lời từ câu 1 đến câu 12. Mỗi câu hỏi thí sinh chỉ chọn một phương án.</w:t>
       </w:r>
     </w:p>
     <w:p>
@@ -514,41 +530,32 @@
     <w:p>
       <w:pPr>
         <w:pStyle w:val="BodyText"/>
+        <w:tabs>
+          <w:tab w:val="left" w:pos="425"/>
+        </w:tabs>
         <w:jc w:val="both"/>
-        <w:spacing w:before="0" w:after="40" w:line="276" w:lineRule="auto"/>
+        <w:ind w:left="425" w:hanging="425"/>
+        <w:spacing w:before="0" w:after="50" w:line="276" w:lineRule="auto"/>
       </w:pPr>
       <w:r>
-        <w:rPr>
-          <w:rFonts w:ascii="Times New Roman" w:hAnsi="Times New Roman"/>
+        <w:t xml:space="preserve"/>
+        <w:tab/>
+        <w:t/>
+      </w:r>
+      <w:r>
+        <w:rPr>
           <w:b/>
           <w:bCs/>
-          <w:sz w:val="24"/>
-          <w:rFonts w:ascii="Times New Roman" w:hAnsi="Times New Roman" w:cs="Times New Roman"/>
         </w:rPr>
         <w:t xml:space="preserve">A.</w:t>
       </w:r>
       <w:r>
-        <w:rPr>
-          <w:rFonts w:ascii="Times New Roman" w:hAnsi="Times New Roman"/>
-          <w:sz w:val="24"/>
-          <w:rFonts w:ascii="Times New Roman" w:hAnsi="Times New Roman" w:cs="Times New Roman"/>
-        </w:rPr>
-        <w:t xml:space="preserve"> </w:t>
-      </w:r>
-      <w:r>
-        <w:rPr>
-          <w:rFonts w:ascii="Times New Roman" w:hAnsi="Times New Roman"/>
-          <w:sz w:val="24"/>
-          <w:rFonts w:ascii="Times New Roman" w:hAnsi="Times New Roman" w:cs="Times New Roman"/>
-        </w:rPr>
+        <w:t xml:space="preserve"> </w:t>
+      </w:r>
+      <w:r>
         <w:t xml:space="preserve">Hàm số</w:t>
       </w:r>
       <w:r>
-        <w:rPr>
-          <w:rFonts w:ascii="Times New Roman" w:hAnsi="Times New Roman"/>
-          <w:sz w:val="24"/>
-          <w:rFonts w:ascii="Times New Roman" w:hAnsi="Times New Roman" w:cs="Times New Roman"/>
-        </w:rPr>
         <w:t xml:space="preserve"> </w:t>
       </w:r>
       <m:oMath>
@@ -581,27 +588,12 @@
         </m:r>
       </m:oMath>
       <w:r>
-        <w:rPr>
-          <w:rFonts w:ascii="Times New Roman" w:hAnsi="Times New Roman"/>
-          <w:sz w:val="24"/>
-          <w:rFonts w:ascii="Times New Roman" w:hAnsi="Times New Roman" w:cs="Times New Roman"/>
-        </w:rPr>
-        <w:t xml:space="preserve"> </w:t>
-      </w:r>
-      <w:r>
-        <w:rPr>
-          <w:rFonts w:ascii="Times New Roman" w:hAnsi="Times New Roman"/>
-          <w:sz w:val="24"/>
-          <w:rFonts w:ascii="Times New Roman" w:hAnsi="Times New Roman" w:cs="Times New Roman"/>
-        </w:rPr>
+        <w:t xml:space="preserve"> </w:t>
+      </w:r>
+      <w:r>
         <w:t xml:space="preserve">đồng biến trên cả hai khoảng</w:t>
       </w:r>
       <w:r>
-        <w:rPr>
-          <w:rFonts w:ascii="Times New Roman" w:hAnsi="Times New Roman"/>
-          <w:sz w:val="24"/>
-          <w:rFonts w:ascii="Times New Roman" w:hAnsi="Times New Roman" w:cs="Times New Roman"/>
-        </w:rPr>
         <w:t xml:space="preserve"> </w:t>
       </w:r>
       <m:oMath>
@@ -631,27 +623,12 @@
         </m:r>
       </m:oMath>
       <w:r>
-        <w:rPr>
-          <w:rFonts w:ascii="Times New Roman" w:hAnsi="Times New Roman"/>
-          <w:sz w:val="24"/>
-          <w:rFonts w:ascii="Times New Roman" w:hAnsi="Times New Roman" w:cs="Times New Roman"/>
-        </w:rPr>
-        <w:t xml:space="preserve"> </w:t>
-      </w:r>
-      <w:r>
-        <w:rPr>
-          <w:rFonts w:ascii="Times New Roman" w:hAnsi="Times New Roman"/>
-          <w:sz w:val="24"/>
-          <w:rFonts w:ascii="Times New Roman" w:hAnsi="Times New Roman" w:cs="Times New Roman"/>
-        </w:rPr>
+        <w:t xml:space="preserve"> </w:t>
+      </w:r>
+      <w:r>
         <w:t xml:space="preserve">và</w:t>
       </w:r>
       <w:r>
-        <w:rPr>
-          <w:rFonts w:ascii="Times New Roman" w:hAnsi="Times New Roman"/>
-          <w:sz w:val="24"/>
-          <w:rFonts w:ascii="Times New Roman" w:hAnsi="Times New Roman" w:cs="Times New Roman"/>
-        </w:rPr>
         <w:t xml:space="preserve"> </w:t>
       </w:r>
       <m:oMath>
@@ -681,52 +658,38 @@
         </m:r>
       </m:oMath>
       <w:r>
-        <w:rPr>
-          <w:rFonts w:ascii="Times New Roman" w:hAnsi="Times New Roman"/>
-          <w:sz w:val="24"/>
-          <w:rFonts w:ascii="Times New Roman" w:hAnsi="Times New Roman" w:cs="Times New Roman"/>
-        </w:rPr>
         <w:t xml:space="preserve">.</w:t>
       </w:r>
     </w:p>
     <w:p>
       <w:pPr>
         <w:pStyle w:val="BodyText"/>
+        <w:tabs>
+          <w:tab w:val="left" w:pos="425"/>
+        </w:tabs>
         <w:jc w:val="both"/>
-        <w:spacing w:before="0" w:after="40" w:line="276" w:lineRule="auto"/>
+        <w:ind w:left="425" w:hanging="425"/>
+        <w:spacing w:before="0" w:after="50" w:line="276" w:lineRule="auto"/>
       </w:pPr>
       <w:r>
-        <w:rPr>
-          <w:rFonts w:ascii="Times New Roman" w:hAnsi="Times New Roman"/>
+        <w:t xml:space="preserve"/>
+        <w:tab/>
+        <w:t/>
+      </w:r>
+      <w:r>
+        <w:rPr>
           <w:b/>
           <w:bCs/>
-          <w:sz w:val="24"/>
-          <w:rFonts w:ascii="Times New Roman" w:hAnsi="Times New Roman" w:cs="Times New Roman"/>
         </w:rPr>
         <w:t xml:space="preserve">B.</w:t>
       </w:r>
       <w:r>
-        <w:rPr>
-          <w:rFonts w:ascii="Times New Roman" w:hAnsi="Times New Roman"/>
-          <w:sz w:val="24"/>
-          <w:rFonts w:ascii="Times New Roman" w:hAnsi="Times New Roman" w:cs="Times New Roman"/>
-        </w:rPr>
-        <w:t xml:space="preserve"> </w:t>
-      </w:r>
-      <w:r>
-        <w:rPr>
-          <w:rFonts w:ascii="Times New Roman" w:hAnsi="Times New Roman"/>
-          <w:sz w:val="24"/>
-          <w:rFonts w:ascii="Times New Roman" w:hAnsi="Times New Roman" w:cs="Times New Roman"/>
-        </w:rPr>
+        <w:t xml:space="preserve"> </w:t>
+      </w:r>
+      <w:r>
         <w:t xml:space="preserve">Hàm số</w:t>
       </w:r>
       <w:r>
-        <w:rPr>
-          <w:rFonts w:ascii="Times New Roman" w:hAnsi="Times New Roman"/>
-          <w:sz w:val="24"/>
-          <w:rFonts w:ascii="Times New Roman" w:hAnsi="Times New Roman" w:cs="Times New Roman"/>
-        </w:rPr>
         <w:t xml:space="preserve"> </w:t>
       </w:r>
       <m:oMath>
@@ -759,27 +722,12 @@
         </m:r>
       </m:oMath>
       <w:r>
-        <w:rPr>
-          <w:rFonts w:ascii="Times New Roman" w:hAnsi="Times New Roman"/>
-          <w:sz w:val="24"/>
-          <w:rFonts w:ascii="Times New Roman" w:hAnsi="Times New Roman" w:cs="Times New Roman"/>
-        </w:rPr>
-        <w:t xml:space="preserve"> </w:t>
-      </w:r>
-      <w:r>
-        <w:rPr>
-          <w:rFonts w:ascii="Times New Roman" w:hAnsi="Times New Roman"/>
-          <w:sz w:val="24"/>
-          <w:rFonts w:ascii="Times New Roman" w:hAnsi="Times New Roman" w:cs="Times New Roman"/>
-        </w:rPr>
+        <w:t xml:space="preserve"> </w:t>
+      </w:r>
+      <w:r>
         <w:t xml:space="preserve">nghịch biến trên cả hai khoảng</w:t>
       </w:r>
       <w:r>
-        <w:rPr>
-          <w:rFonts w:ascii="Times New Roman" w:hAnsi="Times New Roman"/>
-          <w:sz w:val="24"/>
-          <w:rFonts w:ascii="Times New Roman" w:hAnsi="Times New Roman" w:cs="Times New Roman"/>
-        </w:rPr>
         <w:t xml:space="preserve"> </w:t>
       </w:r>
       <m:oMath>
@@ -809,27 +757,12 @@
         </m:r>
       </m:oMath>
       <w:r>
-        <w:rPr>
-          <w:rFonts w:ascii="Times New Roman" w:hAnsi="Times New Roman"/>
-          <w:sz w:val="24"/>
-          <w:rFonts w:ascii="Times New Roman" w:hAnsi="Times New Roman" w:cs="Times New Roman"/>
-        </w:rPr>
-        <w:t xml:space="preserve"> </w:t>
-      </w:r>
-      <w:r>
-        <w:rPr>
-          <w:rFonts w:ascii="Times New Roman" w:hAnsi="Times New Roman"/>
-          <w:sz w:val="24"/>
-          <w:rFonts w:ascii="Times New Roman" w:hAnsi="Times New Roman" w:cs="Times New Roman"/>
-        </w:rPr>
+        <w:t xml:space="preserve"> </w:t>
+      </w:r>
+      <w:r>
         <w:t xml:space="preserve">và</w:t>
       </w:r>
       <w:r>
-        <w:rPr>
-          <w:rFonts w:ascii="Times New Roman" w:hAnsi="Times New Roman"/>
-          <w:sz w:val="24"/>
-          <w:rFonts w:ascii="Times New Roman" w:hAnsi="Times New Roman" w:cs="Times New Roman"/>
-        </w:rPr>
         <w:t xml:space="preserve"> </w:t>
       </w:r>
       <m:oMath>
@@ -859,52 +792,38 @@
         </m:r>
       </m:oMath>
       <w:r>
-        <w:rPr>
-          <w:rFonts w:ascii="Times New Roman" w:hAnsi="Times New Roman"/>
-          <w:sz w:val="24"/>
-          <w:rFonts w:ascii="Times New Roman" w:hAnsi="Times New Roman" w:cs="Times New Roman"/>
-        </w:rPr>
         <w:t xml:space="preserve">.</w:t>
       </w:r>
     </w:p>
     <w:p>
       <w:pPr>
         <w:pStyle w:val="BodyText"/>
+        <w:tabs>
+          <w:tab w:val="left" w:pos="425"/>
+        </w:tabs>
         <w:jc w:val="both"/>
-        <w:spacing w:before="0" w:after="40" w:line="276" w:lineRule="auto"/>
+        <w:ind w:left="425" w:hanging="425"/>
+        <w:spacing w:before="0" w:after="50" w:line="276" w:lineRule="auto"/>
       </w:pPr>
       <w:r>
-        <w:rPr>
-          <w:rFonts w:ascii="Times New Roman" w:hAnsi="Times New Roman"/>
+        <w:t xml:space="preserve"/>
+        <w:tab/>
+        <w:t/>
+      </w:r>
+      <w:r>
+        <w:rPr>
           <w:b/>
           <w:bCs/>
-          <w:sz w:val="24"/>
-          <w:rFonts w:ascii="Times New Roman" w:hAnsi="Times New Roman" w:cs="Times New Roman"/>
         </w:rPr>
         <w:t xml:space="preserve">C.</w:t>
       </w:r>
       <w:r>
-        <w:rPr>
-          <w:rFonts w:ascii="Times New Roman" w:hAnsi="Times New Roman"/>
-          <w:sz w:val="24"/>
-          <w:rFonts w:ascii="Times New Roman" w:hAnsi="Times New Roman" w:cs="Times New Roman"/>
-        </w:rPr>
-        <w:t xml:space="preserve"> </w:t>
-      </w:r>
-      <w:r>
-        <w:rPr>
-          <w:rFonts w:ascii="Times New Roman" w:hAnsi="Times New Roman"/>
-          <w:sz w:val="24"/>
-          <w:rFonts w:ascii="Times New Roman" w:hAnsi="Times New Roman" w:cs="Times New Roman"/>
-        </w:rPr>
+        <w:t xml:space="preserve"> </w:t>
+      </w:r>
+      <w:r>
         <w:t xml:space="preserve">Hàm số</w:t>
       </w:r>
       <w:r>
-        <w:rPr>
-          <w:rFonts w:ascii="Times New Roman" w:hAnsi="Times New Roman"/>
-          <w:sz w:val="24"/>
-          <w:rFonts w:ascii="Times New Roman" w:hAnsi="Times New Roman" w:cs="Times New Roman"/>
-        </w:rPr>
         <w:t xml:space="preserve"> </w:t>
       </w:r>
       <m:oMath>
@@ -937,27 +856,12 @@
         </m:r>
       </m:oMath>
       <w:r>
-        <w:rPr>
-          <w:rFonts w:ascii="Times New Roman" w:hAnsi="Times New Roman"/>
-          <w:sz w:val="24"/>
-          <w:rFonts w:ascii="Times New Roman" w:hAnsi="Times New Roman" w:cs="Times New Roman"/>
-        </w:rPr>
-        <w:t xml:space="preserve"> </w:t>
-      </w:r>
-      <w:r>
-        <w:rPr>
-          <w:rFonts w:ascii="Times New Roman" w:hAnsi="Times New Roman"/>
-          <w:sz w:val="24"/>
-          <w:rFonts w:ascii="Times New Roman" w:hAnsi="Times New Roman" w:cs="Times New Roman"/>
-        </w:rPr>
+        <w:t xml:space="preserve"> </w:t>
+      </w:r>
+      <w:r>
         <w:t xml:space="preserve">đồng biến trên khoảng</w:t>
       </w:r>
       <w:r>
-        <w:rPr>
-          <w:rFonts w:ascii="Times New Roman" w:hAnsi="Times New Roman"/>
-          <w:sz w:val="24"/>
-          <w:rFonts w:ascii="Times New Roman" w:hAnsi="Times New Roman" w:cs="Times New Roman"/>
-        </w:rPr>
         <w:t xml:space="preserve"> </w:t>
       </w:r>
       <m:oMath>
@@ -987,27 +891,12 @@
         </m:r>
       </m:oMath>
       <w:r>
-        <w:rPr>
-          <w:rFonts w:ascii="Times New Roman" w:hAnsi="Times New Roman"/>
-          <w:sz w:val="24"/>
-          <w:rFonts w:ascii="Times New Roman" w:hAnsi="Times New Roman" w:cs="Times New Roman"/>
-        </w:rPr>
-        <w:t xml:space="preserve"> </w:t>
-      </w:r>
-      <w:r>
-        <w:rPr>
-          <w:rFonts w:ascii="Times New Roman" w:hAnsi="Times New Roman"/>
-          <w:sz w:val="24"/>
-          <w:rFonts w:ascii="Times New Roman" w:hAnsi="Times New Roman" w:cs="Times New Roman"/>
-        </w:rPr>
+        <w:t xml:space="preserve"> </w:t>
+      </w:r>
+      <w:r>
         <w:t xml:space="preserve">và nghịch biến trên khoảng</w:t>
       </w:r>
       <w:r>
-        <w:rPr>
-          <w:rFonts w:ascii="Times New Roman" w:hAnsi="Times New Roman"/>
-          <w:sz w:val="24"/>
-          <w:rFonts w:ascii="Times New Roman" w:hAnsi="Times New Roman" w:cs="Times New Roman"/>
-        </w:rPr>
         <w:t xml:space="preserve"> </w:t>
       </w:r>
       <m:oMath>
@@ -1037,52 +926,38 @@
         </m:r>
       </m:oMath>
       <w:r>
-        <w:rPr>
-          <w:rFonts w:ascii="Times New Roman" w:hAnsi="Times New Roman"/>
-          <w:sz w:val="24"/>
-          <w:rFonts w:ascii="Times New Roman" w:hAnsi="Times New Roman" w:cs="Times New Roman"/>
-        </w:rPr>
         <w:t xml:space="preserve">.</w:t>
       </w:r>
     </w:p>
     <w:p>
       <w:pPr>
         <w:pStyle w:val="BodyText"/>
+        <w:tabs>
+          <w:tab w:val="left" w:pos="425"/>
+        </w:tabs>
         <w:jc w:val="both"/>
-        <w:spacing w:before="0" w:after="40" w:line="276" w:lineRule="auto"/>
+        <w:ind w:left="425" w:hanging="425"/>
+        <w:spacing w:before="0" w:after="50" w:line="276" w:lineRule="auto"/>
       </w:pPr>
       <w:r>
-        <w:rPr>
-          <w:rFonts w:ascii="Times New Roman" w:hAnsi="Times New Roman"/>
+        <w:t xml:space="preserve"/>
+        <w:tab/>
+        <w:t/>
+      </w:r>
+      <w:r>
+        <w:rPr>
           <w:b/>
           <w:bCs/>
-          <w:sz w:val="24"/>
-          <w:rFonts w:ascii="Times New Roman" w:hAnsi="Times New Roman" w:cs="Times New Roman"/>
         </w:rPr>
         <w:t xml:space="preserve">D.</w:t>
       </w:r>
       <w:r>
-        <w:rPr>
-          <w:rFonts w:ascii="Times New Roman" w:hAnsi="Times New Roman"/>
-          <w:sz w:val="24"/>
-          <w:rFonts w:ascii="Times New Roman" w:hAnsi="Times New Roman" w:cs="Times New Roman"/>
-        </w:rPr>
-        <w:t xml:space="preserve"> </w:t>
-      </w:r>
-      <w:r>
-        <w:rPr>
-          <w:rFonts w:ascii="Times New Roman" w:hAnsi="Times New Roman"/>
-          <w:sz w:val="24"/>
-          <w:rFonts w:ascii="Times New Roman" w:hAnsi="Times New Roman" w:cs="Times New Roman"/>
-        </w:rPr>
+        <w:t xml:space="preserve"> </w:t>
+      </w:r>
+      <w:r>
         <w:t xml:space="preserve">Hàm số</w:t>
       </w:r>
       <w:r>
-        <w:rPr>
-          <w:rFonts w:ascii="Times New Roman" w:hAnsi="Times New Roman"/>
-          <w:sz w:val="24"/>
-          <w:rFonts w:ascii="Times New Roman" w:hAnsi="Times New Roman" w:cs="Times New Roman"/>
-        </w:rPr>
         <w:t xml:space="preserve"> </w:t>
       </w:r>
       <m:oMath>
@@ -1115,27 +990,12 @@
         </m:r>
       </m:oMath>
       <w:r>
-        <w:rPr>
-          <w:rFonts w:ascii="Times New Roman" w:hAnsi="Times New Roman"/>
-          <w:sz w:val="24"/>
-          <w:rFonts w:ascii="Times New Roman" w:hAnsi="Times New Roman" w:cs="Times New Roman"/>
-        </w:rPr>
-        <w:t xml:space="preserve"> </w:t>
-      </w:r>
-      <w:r>
-        <w:rPr>
-          <w:rFonts w:ascii="Times New Roman" w:hAnsi="Times New Roman"/>
-          <w:sz w:val="24"/>
-          <w:rFonts w:ascii="Times New Roman" w:hAnsi="Times New Roman" w:cs="Times New Roman"/>
-        </w:rPr>
+        <w:t xml:space="preserve"> </w:t>
+      </w:r>
+      <w:r>
         <w:t xml:space="preserve">nghịch biến trên khoảng</w:t>
       </w:r>
       <w:r>
-        <w:rPr>
-          <w:rFonts w:ascii="Times New Roman" w:hAnsi="Times New Roman"/>
-          <w:sz w:val="24"/>
-          <w:rFonts w:ascii="Times New Roman" w:hAnsi="Times New Roman" w:cs="Times New Roman"/>
-        </w:rPr>
         <w:t xml:space="preserve"> </w:t>
       </w:r>
       <m:oMath>
@@ -1165,27 +1025,12 @@
         </m:r>
       </m:oMath>
       <w:r>
-        <w:rPr>
-          <w:rFonts w:ascii="Times New Roman" w:hAnsi="Times New Roman"/>
-          <w:sz w:val="24"/>
-          <w:rFonts w:ascii="Times New Roman" w:hAnsi="Times New Roman" w:cs="Times New Roman"/>
-        </w:rPr>
-        <w:t xml:space="preserve"> </w:t>
-      </w:r>
-      <w:r>
-        <w:rPr>
-          <w:rFonts w:ascii="Times New Roman" w:hAnsi="Times New Roman"/>
-          <w:sz w:val="24"/>
-          <w:rFonts w:ascii="Times New Roman" w:hAnsi="Times New Roman" w:cs="Times New Roman"/>
-        </w:rPr>
+        <w:t xml:space="preserve"> </w:t>
+      </w:r>
+      <w:r>
         <w:t xml:space="preserve">và đồng biến trên khoảng</w:t>
       </w:r>
       <w:r>
-        <w:rPr>
-          <w:rFonts w:ascii="Times New Roman" w:hAnsi="Times New Roman"/>
-          <w:sz w:val="24"/>
-          <w:rFonts w:ascii="Times New Roman" w:hAnsi="Times New Roman" w:cs="Times New Roman"/>
-        </w:rPr>
         <w:t xml:space="preserve"> </w:t>
       </w:r>
       <m:oMath>
@@ -1215,11 +1060,6 @@
         </m:r>
       </m:oMath>
       <w:r>
-        <w:rPr>
-          <w:rFonts w:ascii="Times New Roman" w:hAnsi="Times New Roman"/>
-          <w:sz w:val="24"/>
-          <w:rFonts w:ascii="Times New Roman" w:hAnsi="Times New Roman" w:cs="Times New Roman"/>
-        </w:rPr>
         <w:t xml:space="preserve">.</w:t>
       </w:r>
     </w:p>
@@ -1366,14 +1206,20 @@
     <w:p>
       <w:pPr>
         <w:pStyle w:val="BodyText"/>
+        <w:tabs>
+          <w:tab w:val="left" w:pos="425"/>
+          <w:tab w:val="left" w:pos="2693"/>
+          <w:tab w:val="left" w:pos="5103"/>
+          <w:tab w:val="left" w:pos="7512"/>
+        </w:tabs>
         <w:jc w:val="left"/>
-        <w:tabs>
-          <w:tab w:val="left" w:pos="2495"/>
-          <w:tab w:val="left" w:pos="4990"/>
-          <w:tab w:val="left" w:pos="7484"/>
-        </w:tabs>
-        <w:spacing w:before="0" w:after="70" w:line="276" w:lineRule="auto"/>
+        <w:spacing w:before="0" w:after="50" w:line="276" w:lineRule="auto"/>
       </w:pPr>
+      <w:r>
+        <w:t xml:space="preserve"/>
+        <w:tab/>
+        <w:t/>
+      </w:r>
       <w:r>
         <w:rPr>
           <w:b/>
@@ -1579,12 +1425,18 @@
     <w:p>
       <w:pPr>
         <w:pStyle w:val="BodyText"/>
+        <w:tabs>
+          <w:tab w:val="left" w:pos="425"/>
+          <w:tab w:val="left" w:pos="5103"/>
+        </w:tabs>
         <w:jc w:val="left"/>
-        <w:tabs>
-          <w:tab w:val="left" w:pos="4990"/>
-        </w:tabs>
-        <w:spacing w:before="0" w:after="70" w:line="276" w:lineRule="auto"/>
+        <w:spacing w:before="0" w:after="50" w:line="276" w:lineRule="auto"/>
       </w:pPr>
+      <w:r>
+        <w:t xml:space="preserve"/>
+        <w:tab/>
+        <w:t/>
+      </w:r>
       <w:r>
         <w:rPr>
           <w:b/>
@@ -1783,12 +1635,18 @@
     <w:p>
       <w:pPr>
         <w:pStyle w:val="BodyText"/>
+        <w:tabs>
+          <w:tab w:val="left" w:pos="425"/>
+          <w:tab w:val="left" w:pos="5103"/>
+        </w:tabs>
         <w:jc w:val="left"/>
-        <w:tabs>
-          <w:tab w:val="left" w:pos="4990"/>
-        </w:tabs>
-        <w:spacing w:before="0" w:after="70" w:line="276" w:lineRule="auto"/>
+        <w:spacing w:before="0" w:after="50" w:line="276" w:lineRule="auto"/>
       </w:pPr>
+      <w:r>
+        <w:t xml:space="preserve"/>
+        <w:tab/>
+        <w:t/>
+      </w:r>
       <w:r>
         <w:rPr>
           <w:b/>
@@ -2165,12 +2023,18 @@
           <w:p>
             <w:pPr>
               <w:pStyle w:val="BodyText"/>
+              <w:tabs>
+                <w:tab w:val="left" w:pos="283"/>
+                <w:tab w:val="left" w:pos="3402"/>
+              </w:tabs>
               <w:jc w:val="left"/>
-              <w:tabs>
-                <w:tab w:val="left" w:pos="3289"/>
-              </w:tabs>
-              <w:spacing w:before="0" w:after="70" w:line="276" w:lineRule="auto"/>
+              <w:spacing w:before="0" w:after="50" w:line="276" w:lineRule="auto"/>
             </w:pPr>
+            <w:r>
+              <w:t xml:space="preserve"/>
+              <w:tab/>
+              <w:t/>
+            </w:r>
             <w:r>
               <w:rPr>
                 <w:b/>
@@ -2261,12 +2125,18 @@
           <w:p>
             <w:pPr>
               <w:pStyle w:val="BodyText"/>
+              <w:tabs>
+                <w:tab w:val="left" w:pos="283"/>
+                <w:tab w:val="left" w:pos="3402"/>
+              </w:tabs>
               <w:jc w:val="left"/>
-              <w:tabs>
-                <w:tab w:val="left" w:pos="3289"/>
-              </w:tabs>
-              <w:spacing w:before="0" w:after="70" w:line="276" w:lineRule="auto"/>
+              <w:spacing w:before="0" w:after="50" w:line="276" w:lineRule="auto"/>
             </w:pPr>
+            <w:r>
+              <w:t xml:space="preserve"/>
+              <w:tab/>
+              <w:t/>
+            </w:r>
             <w:r>
               <w:rPr>
                 <w:b/>
@@ -2530,12 +2400,18 @@
     <w:p>
       <w:pPr>
         <w:pStyle w:val="BodyText"/>
+        <w:tabs>
+          <w:tab w:val="left" w:pos="425"/>
+          <w:tab w:val="left" w:pos="5103"/>
+        </w:tabs>
         <w:jc w:val="left"/>
-        <w:tabs>
-          <w:tab w:val="left" w:pos="4990"/>
-        </w:tabs>
-        <w:spacing w:before="0" w:after="70" w:line="276" w:lineRule="auto"/>
+        <w:spacing w:before="0" w:after="50" w:line="276" w:lineRule="auto"/>
       </w:pPr>
+      <w:r>
+        <w:t xml:space="preserve"/>
+        <w:tab/>
+        <w:t/>
+      </w:r>
       <w:r>
         <w:rPr>
           <w:b/>
@@ -2725,12 +2601,18 @@
     <w:p>
       <w:pPr>
         <w:pStyle w:val="BodyText"/>
+        <w:tabs>
+          <w:tab w:val="left" w:pos="425"/>
+          <w:tab w:val="left" w:pos="5103"/>
+        </w:tabs>
         <w:jc w:val="left"/>
-        <w:tabs>
-          <w:tab w:val="left" w:pos="4990"/>
-        </w:tabs>
-        <w:spacing w:before="0" w:after="70" w:line="276" w:lineRule="auto"/>
+        <w:spacing w:before="0" w:after="50" w:line="276" w:lineRule="auto"/>
       </w:pPr>
+      <w:r>
+        <w:t xml:space="preserve"/>
+        <w:tab/>
+        <w:t/>
+      </w:r>
       <w:r>
         <w:rPr>
           <w:b/>
@@ -3238,14 +3120,20 @@
     <w:p>
       <w:pPr>
         <w:pStyle w:val="BodyText"/>
+        <w:tabs>
+          <w:tab w:val="left" w:pos="425"/>
+          <w:tab w:val="left" w:pos="2693"/>
+          <w:tab w:val="left" w:pos="5103"/>
+          <w:tab w:val="left" w:pos="7512"/>
+        </w:tabs>
         <w:jc w:val="left"/>
-        <w:tabs>
-          <w:tab w:val="left" w:pos="2495"/>
-          <w:tab w:val="left" w:pos="4990"/>
-          <w:tab w:val="left" w:pos="7484"/>
-        </w:tabs>
-        <w:spacing w:before="0" w:after="70" w:line="276" w:lineRule="auto"/>
+        <w:spacing w:before="0" w:after="50" w:line="276" w:lineRule="auto"/>
       </w:pPr>
+      <w:r>
+        <w:t xml:space="preserve"/>
+        <w:tab/>
+        <w:t/>
+      </w:r>
       <w:r>
         <w:rPr>
           <w:b/>
@@ -3582,14 +3470,20 @@
     <w:p>
       <w:pPr>
         <w:pStyle w:val="BodyText"/>
+        <w:tabs>
+          <w:tab w:val="left" w:pos="425"/>
+          <w:tab w:val="left" w:pos="2693"/>
+          <w:tab w:val="left" w:pos="5103"/>
+          <w:tab w:val="left" w:pos="7512"/>
+        </w:tabs>
         <w:jc w:val="left"/>
-        <w:tabs>
-          <w:tab w:val="left" w:pos="2495"/>
-          <w:tab w:val="left" w:pos="4990"/>
-          <w:tab w:val="left" w:pos="7484"/>
-        </w:tabs>
-        <w:spacing w:before="0" w:after="70" w:line="276" w:lineRule="auto"/>
+        <w:spacing w:before="0" w:after="50" w:line="276" w:lineRule="auto"/>
       </w:pPr>
+      <w:r>
+        <w:t xml:space="preserve"/>
+        <w:tab/>
+        <w:t/>
+      </w:r>
       <w:r>
         <w:rPr>
           <w:b/>
@@ -3977,12 +3871,18 @@
           <w:p>
             <w:pPr>
               <w:pStyle w:val="BodyText"/>
+              <w:tabs>
+                <w:tab w:val="left" w:pos="283"/>
+                <w:tab w:val="left" w:pos="3402"/>
+              </w:tabs>
               <w:jc w:val="left"/>
-              <w:tabs>
-                <w:tab w:val="left" w:pos="3289"/>
-              </w:tabs>
-              <w:spacing w:before="0" w:after="70" w:line="276" w:lineRule="auto"/>
+              <w:spacing w:before="0" w:after="50" w:line="276" w:lineRule="auto"/>
             </w:pPr>
+            <w:r>
+              <w:t xml:space="preserve"/>
+              <w:tab/>
+              <w:t/>
+            </w:r>
             <w:r>
               <w:rPr>
                 <w:b/>
@@ -4073,12 +3973,18 @@
           <w:p>
             <w:pPr>
               <w:pStyle w:val="BodyText"/>
+              <w:tabs>
+                <w:tab w:val="left" w:pos="283"/>
+                <w:tab w:val="left" w:pos="3402"/>
+              </w:tabs>
               <w:jc w:val="left"/>
-              <w:tabs>
-                <w:tab w:val="left" w:pos="3289"/>
-              </w:tabs>
-              <w:spacing w:before="0" w:after="70" w:line="276" w:lineRule="auto"/>
+              <w:spacing w:before="0" w:after="50" w:line="276" w:lineRule="auto"/>
             </w:pPr>
+            <w:r>
+              <w:t xml:space="preserve"/>
+              <w:tab/>
+              <w:t/>
+            </w:r>
             <w:r>
               <w:rPr>
                 <w:b/>
@@ -4814,14 +4720,20 @@
     <w:p>
       <w:pPr>
         <w:pStyle w:val="BodyText"/>
+        <w:tabs>
+          <w:tab w:val="left" w:pos="425"/>
+          <w:tab w:val="left" w:pos="2693"/>
+          <w:tab w:val="left" w:pos="5103"/>
+          <w:tab w:val="left" w:pos="7512"/>
+        </w:tabs>
         <w:jc w:val="left"/>
-        <w:tabs>
-          <w:tab w:val="left" w:pos="2495"/>
-          <w:tab w:val="left" w:pos="4990"/>
-          <w:tab w:val="left" w:pos="7484"/>
-        </w:tabs>
-        <w:spacing w:before="0" w:after="70" w:line="276" w:lineRule="auto"/>
+        <w:spacing w:before="0" w:after="50" w:line="276" w:lineRule="auto"/>
       </w:pPr>
+      <w:r>
+        <w:t xml:space="preserve"/>
+        <w:tab/>
+        <w:t/>
+      </w:r>
       <w:r>
         <w:rPr>
           <w:b/>
@@ -5151,14 +5063,20 @@
     <w:p>
       <w:pPr>
         <w:pStyle w:val="BodyText"/>
+        <w:tabs>
+          <w:tab w:val="left" w:pos="425"/>
+          <w:tab w:val="left" w:pos="2693"/>
+          <w:tab w:val="left" w:pos="5103"/>
+          <w:tab w:val="left" w:pos="7512"/>
+        </w:tabs>
         <w:jc w:val="left"/>
-        <w:tabs>
-          <w:tab w:val="left" w:pos="2495"/>
-          <w:tab w:val="left" w:pos="4990"/>
-          <w:tab w:val="left" w:pos="7484"/>
-        </w:tabs>
-        <w:spacing w:before="0" w:after="70" w:line="276" w:lineRule="auto"/>
+        <w:spacing w:before="0" w:after="50" w:line="276" w:lineRule="auto"/>
       </w:pPr>
+      <w:r>
+        <w:t xml:space="preserve"/>
+        <w:tab/>
+        <w:t/>
+      </w:r>
       <w:r>
         <w:rPr>
           <w:b/>
@@ -5495,14 +5413,20 @@
     <w:p>
       <w:pPr>
         <w:pStyle w:val="BodyText"/>
+        <w:tabs>
+          <w:tab w:val="left" w:pos="425"/>
+          <w:tab w:val="left" w:pos="2693"/>
+          <w:tab w:val="left" w:pos="5103"/>
+          <w:tab w:val="left" w:pos="7512"/>
+        </w:tabs>
         <w:jc w:val="left"/>
-        <w:tabs>
-          <w:tab w:val="left" w:pos="2495"/>
-          <w:tab w:val="left" w:pos="4990"/>
-          <w:tab w:val="left" w:pos="7484"/>
-        </w:tabs>
-        <w:spacing w:before="0" w:after="70" w:line="276" w:lineRule="auto"/>
+        <w:spacing w:before="0" w:after="50" w:line="276" w:lineRule="auto"/>
       </w:pPr>
+      <w:r>
+        <w:t xml:space="preserve"/>
+        <w:tab/>
+        <w:t/>
+      </w:r>
       <w:r>
         <w:rPr>
           <w:b/>
@@ -5931,12 +5855,18 @@
     <w:p>
       <w:pPr>
         <w:pStyle w:val="BodyText"/>
+        <w:tabs>
+          <w:tab w:val="left" w:pos="425"/>
+          <w:tab w:val="left" w:pos="5103"/>
+        </w:tabs>
         <w:jc w:val="left"/>
-        <w:tabs>
-          <w:tab w:val="left" w:pos="4990"/>
-        </w:tabs>
-        <w:spacing w:before="0" w:after="70" w:line="276" w:lineRule="auto"/>
+        <w:spacing w:before="0" w:after="50" w:line="276" w:lineRule="auto"/>
       </w:pPr>
+      <w:r>
+        <w:t xml:space="preserve"/>
+        <w:tab/>
+        <w:t/>
+      </w:r>
       <w:r>
         <w:rPr>
           <w:b/>
@@ -6077,12 +6007,18 @@
     <w:p>
       <w:pPr>
         <w:pStyle w:val="BodyText"/>
+        <w:tabs>
+          <w:tab w:val="left" w:pos="425"/>
+          <w:tab w:val="left" w:pos="5103"/>
+        </w:tabs>
         <w:jc w:val="left"/>
-        <w:tabs>
-          <w:tab w:val="left" w:pos="4990"/>
-        </w:tabs>
-        <w:spacing w:before="0" w:after="70" w:line="276" w:lineRule="auto"/>
+        <w:spacing w:before="0" w:after="50" w:line="276" w:lineRule="auto"/>
       </w:pPr>
+      <w:r>
+        <w:t xml:space="preserve"/>
+        <w:tab/>
+        <w:t/>
+      </w:r>
       <w:r>
         <w:rPr>
           <w:b/>
@@ -6197,24 +6133,17 @@
     <w:p>
       <w:pPr>
         <w:spacing w:before="160" w:after="40"/>
+        <w:jc w:val="both"/>
       </w:pPr>
       <w:r>
         <w:rPr>
           <w:rFonts w:ascii="Times New Roman" w:hAnsi="Times New Roman"/>
           <w:b/>
-          <w:color w:val="0050A0"/>
-          <w:sz w:val="24"/>
-          <w:bdr w:val="single" w:sz="8" w:space="3" w:color="0050A0"/>
-          <w:shd w:fill="EDF3F8"/>
-          <w:rFonts w:ascii="Times New Roman" w:hAnsi="Times New Roman" w:cs="Times New Roman"/>
-        </w:rPr>
-        <w:t xml:space="preserve">  PHẦN 2. Câu trắc nghiệm đúng sai  </w:t>
-      </w:r>
-    </w:p>
-    <w:p>
-      <w:pPr>
-        <w:spacing w:before="0" w:after="80"/>
-      </w:pPr>
+          <w:sz w:val="24"/>
+          <w:rFonts w:ascii="Times New Roman" w:hAnsi="Times New Roman" w:cs="Times New Roman"/>
+        </w:rPr>
+        <w:t>PHẦN II. Câu trắc nghiệm đúng sai.</w:t>
+      </w:r>
       <w:r>
         <w:rPr>
           <w:rFonts w:ascii="Times New Roman" w:hAnsi="Times New Roman"/>
@@ -6222,7 +6151,7 @@
           <w:sz w:val="24"/>
           <w:rFonts w:ascii="Times New Roman" w:hAnsi="Times New Roman" w:cs="Times New Roman"/>
         </w:rPr>
-        <w:t>Thí sinh trả lời từ câu 1 đến câu 4. Trong mỗi ý a), b), c), d) ở mỗi câu, thí sinh chọn đúng hoặc sai.</w:t>
+        <w:t xml:space="preserve"> Thí sinh trả lời từ câu 1 đến câu 4. Trong mỗi ý a), b), c), d) ở mỗi câu, thí sinh chọn đúng hoặc sai.</w:t>
       </w:r>
     </w:p>
     <w:p>
@@ -6400,74 +6329,61 @@
     <w:p>
       <w:pPr>
         <w:pStyle w:val="BodyText"/>
+        <w:tabs>
+          <w:tab w:val="left" w:pos="425"/>
+        </w:tabs>
         <w:jc w:val="both"/>
-        <w:spacing w:before="0" w:after="40" w:line="276" w:lineRule="auto"/>
+        <w:ind w:left="425" w:hanging="425"/>
+        <w:spacing w:before="0" w:after="50" w:line="276" w:lineRule="auto"/>
       </w:pPr>
       <w:r>
-        <w:rPr>
-          <w:rFonts w:ascii="Times New Roman" w:hAnsi="Times New Roman"/>
+        <w:t xml:space="preserve"/>
+        <w:tab/>
+        <w:t/>
+      </w:r>
+      <w:r>
+        <w:rPr>
           <w:b/>
           <w:bCs/>
-          <w:sz w:val="24"/>
-          <w:rFonts w:ascii="Times New Roman" w:hAnsi="Times New Roman" w:cs="Times New Roman"/>
         </w:rPr>
         <w:t xml:space="preserve">a)</w:t>
       </w:r>
       <w:r>
-        <w:rPr>
-          <w:rFonts w:ascii="Times New Roman" w:hAnsi="Times New Roman"/>
-          <w:sz w:val="24"/>
-          <w:rFonts w:ascii="Times New Roman" w:hAnsi="Times New Roman" w:cs="Times New Roman"/>
-        </w:rPr>
-        <w:t xml:space="preserve"> </w:t>
-      </w:r>
-      <w:r>
-        <w:rPr>
-          <w:rFonts w:ascii="Times New Roman" w:hAnsi="Times New Roman"/>
-          <w:sz w:val="24"/>
-          <w:rFonts w:ascii="Times New Roman" w:hAnsi="Times New Roman" w:cs="Times New Roman"/>
-        </w:rPr>
+        <w:t xml:space="preserve"> </w:t>
+      </w:r>
+      <w:r>
         <w:t xml:space="preserve">Đồ thị hàm số đã cho có hai đường tiệm cận ngang.</w:t>
       </w:r>
     </w:p>
     <w:p>
       <w:pPr>
         <w:pStyle w:val="BodyText"/>
+        <w:tabs>
+          <w:tab w:val="left" w:pos="425"/>
+        </w:tabs>
         <w:jc w:val="both"/>
-        <w:spacing w:before="0" w:after="40" w:line="276" w:lineRule="auto"/>
+        <w:ind w:left="425" w:hanging="425"/>
+        <w:spacing w:before="0" w:after="50" w:line="276" w:lineRule="auto"/>
       </w:pPr>
       <w:r>
-        <w:rPr>
-          <w:rFonts w:ascii="Times New Roman" w:hAnsi="Times New Roman"/>
+        <w:t xml:space="preserve"/>
+        <w:tab/>
+        <w:t/>
+      </w:r>
+      <w:r>
+        <w:rPr>
           <w:b/>
           <w:bCs/>
-          <w:sz w:val="24"/>
-          <w:rFonts w:ascii="Times New Roman" w:hAnsi="Times New Roman" w:cs="Times New Roman"/>
         </w:rPr>
         <w:t xml:space="preserve">b)</w:t>
       </w:r>
       <w:r>
-        <w:rPr>
-          <w:rFonts w:ascii="Times New Roman" w:hAnsi="Times New Roman"/>
-          <w:sz w:val="24"/>
-          <w:rFonts w:ascii="Times New Roman" w:hAnsi="Times New Roman" w:cs="Times New Roman"/>
-        </w:rPr>
-        <w:t xml:space="preserve"> </w:t>
-      </w:r>
-      <w:r>
-        <w:rPr>
-          <w:rFonts w:ascii="Times New Roman" w:hAnsi="Times New Roman"/>
-          <w:sz w:val="24"/>
-          <w:rFonts w:ascii="Times New Roman" w:hAnsi="Times New Roman" w:cs="Times New Roman"/>
-        </w:rPr>
+        <w:t xml:space="preserve"> </w:t>
+      </w:r>
+      <w:r>
         <w:t xml:space="preserve">Giá trị nhỏ nhất của hàm số trên</w:t>
       </w:r>
       <w:r>
-        <w:rPr>
-          <w:rFonts w:ascii="Times New Roman" w:hAnsi="Times New Roman"/>
-          <w:sz w:val="24"/>
-          <w:rFonts w:ascii="Times New Roman" w:hAnsi="Times New Roman" w:cs="Times New Roman"/>
-        </w:rPr>
         <w:t xml:space="preserve"> </w:t>
       </w:r>
       <m:oMath>
@@ -6515,27 +6431,12 @@
         </m:r>
       </m:oMath>
       <w:r>
-        <w:rPr>
-          <w:rFonts w:ascii="Times New Roman" w:hAnsi="Times New Roman"/>
-          <w:sz w:val="24"/>
-          <w:rFonts w:ascii="Times New Roman" w:hAnsi="Times New Roman" w:cs="Times New Roman"/>
-        </w:rPr>
-        <w:t xml:space="preserve"> </w:t>
-      </w:r>
-      <w:r>
-        <w:rPr>
-          <w:rFonts w:ascii="Times New Roman" w:hAnsi="Times New Roman"/>
-          <w:sz w:val="24"/>
-          <w:rFonts w:ascii="Times New Roman" w:hAnsi="Times New Roman" w:cs="Times New Roman"/>
-        </w:rPr>
+        <w:t xml:space="preserve"> </w:t>
+      </w:r>
+      <w:r>
         <w:t xml:space="preserve">bằng</w:t>
       </w:r>
       <w:r>
-        <w:rPr>
-          <w:rFonts w:ascii="Times New Roman" w:hAnsi="Times New Roman"/>
-          <w:sz w:val="24"/>
-          <w:rFonts w:ascii="Times New Roman" w:hAnsi="Times New Roman" w:cs="Times New Roman"/>
-        </w:rPr>
         <w:t xml:space="preserve"> </w:t>
       </w:r>
       <m:oMath>
@@ -6544,52 +6445,38 @@
         </m:r>
       </m:oMath>
       <w:r>
-        <w:rPr>
-          <w:rFonts w:ascii="Times New Roman" w:hAnsi="Times New Roman"/>
-          <w:sz w:val="24"/>
-          <w:rFonts w:ascii="Times New Roman" w:hAnsi="Times New Roman" w:cs="Times New Roman"/>
-        </w:rPr>
         <w:t xml:space="preserve">.</w:t>
       </w:r>
     </w:p>
     <w:p>
       <w:pPr>
         <w:pStyle w:val="BodyText"/>
+        <w:tabs>
+          <w:tab w:val="left" w:pos="425"/>
+        </w:tabs>
         <w:jc w:val="both"/>
-        <w:spacing w:before="0" w:after="40" w:line="276" w:lineRule="auto"/>
+        <w:ind w:left="425" w:hanging="425"/>
+        <w:spacing w:before="0" w:after="50" w:line="276" w:lineRule="auto"/>
       </w:pPr>
       <w:r>
-        <w:rPr>
-          <w:rFonts w:ascii="Times New Roman" w:hAnsi="Times New Roman"/>
+        <w:t xml:space="preserve"/>
+        <w:tab/>
+        <w:t/>
+      </w:r>
+      <w:r>
+        <w:rPr>
           <w:b/>
           <w:bCs/>
-          <w:sz w:val="24"/>
-          <w:rFonts w:ascii="Times New Roman" w:hAnsi="Times New Roman" w:cs="Times New Roman"/>
         </w:rPr>
         <w:t xml:space="preserve">c)</w:t>
       </w:r>
       <w:r>
-        <w:rPr>
-          <w:rFonts w:ascii="Times New Roman" w:hAnsi="Times New Roman"/>
-          <w:sz w:val="24"/>
-          <w:rFonts w:ascii="Times New Roman" w:hAnsi="Times New Roman" w:cs="Times New Roman"/>
-        </w:rPr>
-        <w:t xml:space="preserve"> </w:t>
-      </w:r>
-      <w:r>
-        <w:rPr>
-          <w:rFonts w:ascii="Times New Roman" w:hAnsi="Times New Roman"/>
-          <w:sz w:val="24"/>
-          <w:rFonts w:ascii="Times New Roman" w:hAnsi="Times New Roman" w:cs="Times New Roman"/>
-        </w:rPr>
+        <w:t xml:space="preserve"> </w:t>
+      </w:r>
+      <w:r>
         <w:t xml:space="preserve">Hàm số đồng biến trên</w:t>
       </w:r>
       <w:r>
-        <w:rPr>
-          <w:rFonts w:ascii="Times New Roman" w:hAnsi="Times New Roman"/>
-          <w:sz w:val="24"/>
-          <w:rFonts w:ascii="Times New Roman" w:hAnsi="Times New Roman" w:cs="Times New Roman"/>
-        </w:rPr>
         <w:t xml:space="preserve"> </w:t>
       </w:r>
       <m:oMath>
@@ -6619,52 +6506,38 @@
         </m:r>
       </m:oMath>
       <w:r>
-        <w:rPr>
-          <w:rFonts w:ascii="Times New Roman" w:hAnsi="Times New Roman"/>
-          <w:sz w:val="24"/>
-          <w:rFonts w:ascii="Times New Roman" w:hAnsi="Times New Roman" w:cs="Times New Roman"/>
-        </w:rPr>
         <w:t xml:space="preserve">.</w:t>
       </w:r>
     </w:p>
     <w:p>
       <w:pPr>
         <w:pStyle w:val="BodyText"/>
+        <w:tabs>
+          <w:tab w:val="left" w:pos="425"/>
+        </w:tabs>
         <w:jc w:val="both"/>
-        <w:spacing w:before="0" w:after="40" w:line="276" w:lineRule="auto"/>
+        <w:ind w:left="425" w:hanging="425"/>
+        <w:spacing w:before="0" w:after="50" w:line="276" w:lineRule="auto"/>
       </w:pPr>
       <w:r>
-        <w:rPr>
-          <w:rFonts w:ascii="Times New Roman" w:hAnsi="Times New Roman"/>
+        <w:t xml:space="preserve"/>
+        <w:tab/>
+        <w:t/>
+      </w:r>
+      <w:r>
+        <w:rPr>
           <w:b/>
           <w:bCs/>
-          <w:sz w:val="24"/>
-          <w:rFonts w:ascii="Times New Roman" w:hAnsi="Times New Roman" w:cs="Times New Roman"/>
         </w:rPr>
         <w:t xml:space="preserve">d)</w:t>
       </w:r>
       <w:r>
-        <w:rPr>
-          <w:rFonts w:ascii="Times New Roman" w:hAnsi="Times New Roman"/>
-          <w:sz w:val="24"/>
-          <w:rFonts w:ascii="Times New Roman" w:hAnsi="Times New Roman" w:cs="Times New Roman"/>
-        </w:rPr>
-        <w:t xml:space="preserve"> </w:t>
-      </w:r>
-      <w:r>
-        <w:rPr>
-          <w:rFonts w:ascii="Times New Roman" w:hAnsi="Times New Roman"/>
-          <w:sz w:val="24"/>
-          <w:rFonts w:ascii="Times New Roman" w:hAnsi="Times New Roman" w:cs="Times New Roman"/>
-        </w:rPr>
+        <w:t xml:space="preserve"> </w:t>
+      </w:r>
+      <w:r>
         <w:t xml:space="preserve">Giá trị lớn nhất của hàm số trên</w:t>
       </w:r>
       <w:r>
-        <w:rPr>
-          <w:rFonts w:ascii="Times New Roman" w:hAnsi="Times New Roman"/>
-          <w:sz w:val="24"/>
-          <w:rFonts w:ascii="Times New Roman" w:hAnsi="Times New Roman" w:cs="Times New Roman"/>
-        </w:rPr>
         <w:t xml:space="preserve"> </w:t>
       </w:r>
       <m:oMath>
@@ -6677,27 +6550,12 @@
         </m:r>
       </m:oMath>
       <w:r>
-        <w:rPr>
-          <w:rFonts w:ascii="Times New Roman" w:hAnsi="Times New Roman"/>
-          <w:sz w:val="24"/>
-          <w:rFonts w:ascii="Times New Roman" w:hAnsi="Times New Roman" w:cs="Times New Roman"/>
-        </w:rPr>
-        <w:t xml:space="preserve"> </w:t>
-      </w:r>
-      <w:r>
-        <w:rPr>
-          <w:rFonts w:ascii="Times New Roman" w:hAnsi="Times New Roman"/>
-          <w:sz w:val="24"/>
-          <w:rFonts w:ascii="Times New Roman" w:hAnsi="Times New Roman" w:cs="Times New Roman"/>
-        </w:rPr>
+        <w:t xml:space="preserve"> </w:t>
+      </w:r>
+      <w:r>
         <w:t xml:space="preserve">bằng</w:t>
       </w:r>
       <w:r>
-        <w:rPr>
-          <w:rFonts w:ascii="Times New Roman" w:hAnsi="Times New Roman"/>
-          <w:sz w:val="24"/>
-          <w:rFonts w:ascii="Times New Roman" w:hAnsi="Times New Roman" w:cs="Times New Roman"/>
-        </w:rPr>
         <w:t xml:space="preserve"> </w:t>
       </w:r>
       <m:oMath>
@@ -6706,11 +6564,6 @@
         </m:r>
       </m:oMath>
       <w:r>
-        <w:rPr>
-          <w:rFonts w:ascii="Times New Roman" w:hAnsi="Times New Roman"/>
-          <w:sz w:val="24"/>
-          <w:rFonts w:ascii="Times New Roman" w:hAnsi="Times New Roman" w:cs="Times New Roman"/>
-        </w:rPr>
         <w:t xml:space="preserve">.</w:t>
       </w:r>
     </w:p>
@@ -7302,25 +7155,26 @@
           <w:p>
             <w:pPr>
               <w:pStyle w:val="BodyText"/>
+              <w:tabs>
+                <w:tab w:val="left" w:pos="425"/>
+              </w:tabs>
               <w:jc w:val="both"/>
-              <w:spacing w:before="0" w:after="40" w:line="276" w:lineRule="auto"/>
+              <w:ind w:left="425" w:hanging="425"/>
+              <w:spacing w:before="0" w:after="50" w:line="276" w:lineRule="auto"/>
             </w:pPr>
             <w:r>
-              <w:rPr>
-                <w:rFonts w:ascii="Times New Roman" w:hAnsi="Times New Roman"/>
+              <w:t xml:space="preserve"/>
+              <w:tab/>
+              <w:t/>
+            </w:r>
+            <w:r>
+              <w:rPr>
                 <w:b/>
                 <w:bCs/>
-                <w:sz w:val="24"/>
-                <w:rFonts w:ascii="Times New Roman" w:hAnsi="Times New Roman" w:cs="Times New Roman"/>
               </w:rPr>
               <w:t xml:space="preserve">a)</w:t>
             </w:r>
             <w:r>
-              <w:rPr>
-                <w:rFonts w:ascii="Times New Roman" w:hAnsi="Times New Roman"/>
-                <w:sz w:val="24"/>
-                <w:rFonts w:ascii="Times New Roman" w:hAnsi="Times New Roman" w:cs="Times New Roman"/>
-              </w:rPr>
               <w:t xml:space="preserve"> </w:t>
             </w:r>
             <m:oMath>
@@ -7374,52 +7228,38 @@
               </m:f>
             </m:oMath>
             <w:r>
-              <w:rPr>
-                <w:rFonts w:ascii="Times New Roman" w:hAnsi="Times New Roman"/>
-                <w:sz w:val="24"/>
-                <w:rFonts w:ascii="Times New Roman" w:hAnsi="Times New Roman" w:cs="Times New Roman"/>
-              </w:rPr>
               <w:t xml:space="preserve">.</w:t>
             </w:r>
           </w:p>
           <w:p>
             <w:pPr>
               <w:pStyle w:val="BodyText"/>
+              <w:tabs>
+                <w:tab w:val="left" w:pos="425"/>
+              </w:tabs>
               <w:jc w:val="both"/>
-              <w:spacing w:before="0" w:after="40" w:line="276" w:lineRule="auto"/>
+              <w:ind w:left="425" w:hanging="425"/>
+              <w:spacing w:before="0" w:after="50" w:line="276" w:lineRule="auto"/>
             </w:pPr>
             <w:r>
-              <w:rPr>
-                <w:rFonts w:ascii="Times New Roman" w:hAnsi="Times New Roman"/>
+              <w:t xml:space="preserve"/>
+              <w:tab/>
+              <w:t/>
+            </w:r>
+            <w:r>
+              <w:rPr>
                 <w:b/>
                 <w:bCs/>
-                <w:sz w:val="24"/>
-                <w:rFonts w:ascii="Times New Roman" w:hAnsi="Times New Roman" w:cs="Times New Roman"/>
               </w:rPr>
               <w:t xml:space="preserve">b)</w:t>
             </w:r>
             <w:r>
-              <w:rPr>
-                <w:rFonts w:ascii="Times New Roman" w:hAnsi="Times New Roman"/>
-                <w:sz w:val="24"/>
-                <w:rFonts w:ascii="Times New Roman" w:hAnsi="Times New Roman" w:cs="Times New Roman"/>
-              </w:rPr>
               <w:t xml:space="preserve"> </w:t>
             </w:r>
             <w:r>
-              <w:rPr>
-                <w:rFonts w:ascii="Times New Roman" w:hAnsi="Times New Roman"/>
-                <w:sz w:val="24"/>
-                <w:rFonts w:ascii="Times New Roman" w:hAnsi="Times New Roman" w:cs="Times New Roman"/>
-              </w:rPr>
               <w:t xml:space="preserve">Tam giác</w:t>
             </w:r>
             <w:r>
-              <w:rPr>
-                <w:rFonts w:ascii="Times New Roman" w:hAnsi="Times New Roman"/>
-                <w:sz w:val="24"/>
-                <w:rFonts w:ascii="Times New Roman" w:hAnsi="Times New Roman" w:cs="Times New Roman"/>
-              </w:rPr>
               <w:t xml:space="preserve"> </w:t>
             </w:r>
             <m:oMath>
@@ -7434,27 +7274,12 @@
               </m:r>
             </m:oMath>
             <w:r>
-              <w:rPr>
-                <w:rFonts w:ascii="Times New Roman" w:hAnsi="Times New Roman"/>
-                <w:sz w:val="24"/>
-                <w:rFonts w:ascii="Times New Roman" w:hAnsi="Times New Roman" w:cs="Times New Roman"/>
-              </w:rPr>
               <w:t xml:space="preserve"> </w:t>
             </w:r>
             <w:r>
-              <w:rPr>
-                <w:rFonts w:ascii="Times New Roman" w:hAnsi="Times New Roman"/>
-                <w:sz w:val="24"/>
-                <w:rFonts w:ascii="Times New Roman" w:hAnsi="Times New Roman" w:cs="Times New Roman"/>
-              </w:rPr>
               <w:t xml:space="preserve">đồng dạng với tam giác</w:t>
             </w:r>
             <w:r>
-              <w:rPr>
-                <w:rFonts w:ascii="Times New Roman" w:hAnsi="Times New Roman"/>
-                <w:sz w:val="24"/>
-                <w:rFonts w:ascii="Times New Roman" w:hAnsi="Times New Roman" w:cs="Times New Roman"/>
-              </w:rPr>
               <w:t xml:space="preserve"> </w:t>
             </w:r>
             <m:oMath>
@@ -7469,36 +7294,32 @@
               </m:r>
             </m:oMath>
             <w:r>
-              <w:rPr>
-                <w:rFonts w:ascii="Times New Roman" w:hAnsi="Times New Roman"/>
-                <w:sz w:val="24"/>
-                <w:rFonts w:ascii="Times New Roman" w:hAnsi="Times New Roman" w:cs="Times New Roman"/>
-              </w:rPr>
               <w:t xml:space="preserve">.</w:t>
             </w:r>
           </w:p>
           <w:p>
             <w:pPr>
               <w:pStyle w:val="BodyText"/>
+              <w:tabs>
+                <w:tab w:val="left" w:pos="425"/>
+              </w:tabs>
               <w:jc w:val="both"/>
-              <w:spacing w:before="0" w:after="40" w:line="276" w:lineRule="auto"/>
+              <w:ind w:left="425" w:hanging="425"/>
+              <w:spacing w:before="0" w:after="50" w:line="276" w:lineRule="auto"/>
             </w:pPr>
             <w:r>
-              <w:rPr>
-                <w:rFonts w:ascii="Times New Roman" w:hAnsi="Times New Roman"/>
+              <w:t xml:space="preserve"/>
+              <w:tab/>
+              <w:t/>
+            </w:r>
+            <w:r>
+              <w:rPr>
                 <w:b/>
                 <w:bCs/>
-                <w:sz w:val="24"/>
-                <w:rFonts w:ascii="Times New Roman" w:hAnsi="Times New Roman" w:cs="Times New Roman"/>
               </w:rPr>
               <w:t xml:space="preserve">c)</w:t>
             </w:r>
             <w:r>
-              <w:rPr>
-                <w:rFonts w:ascii="Times New Roman" w:hAnsi="Times New Roman"/>
-                <w:sz w:val="24"/>
-                <w:rFonts w:ascii="Times New Roman" w:hAnsi="Times New Roman" w:cs="Times New Roman"/>
-              </w:rPr>
               <w:t xml:space="preserve"> </w:t>
             </w:r>
             <m:oMath>
@@ -7526,19 +7347,9 @@
               </m:r>
             </m:oMath>
             <w:r>
-              <w:rPr>
-                <w:rFonts w:ascii="Times New Roman" w:hAnsi="Times New Roman"/>
-                <w:sz w:val="24"/>
-                <w:rFonts w:ascii="Times New Roman" w:hAnsi="Times New Roman" w:cs="Times New Roman"/>
-              </w:rPr>
               <w:t xml:space="preserve">;</w:t>
             </w:r>
             <w:r>
-              <w:rPr>
-                <w:rFonts w:ascii="Times New Roman" w:hAnsi="Times New Roman"/>
-                <w:sz w:val="24"/>
-                <w:rFonts w:ascii="Times New Roman" w:hAnsi="Times New Roman" w:cs="Times New Roman"/>
-              </w:rPr>
               <w:t xml:space="preserve"> </w:t>
             </w:r>
             <m:oMath>
@@ -7566,52 +7377,38 @@
               </m:r>
             </m:oMath>
             <w:r>
-              <w:rPr>
-                <w:rFonts w:ascii="Times New Roman" w:hAnsi="Times New Roman"/>
-                <w:sz w:val="24"/>
-                <w:rFonts w:ascii="Times New Roman" w:hAnsi="Times New Roman" w:cs="Times New Roman"/>
-              </w:rPr>
               <w:t xml:space="preserve">.</w:t>
             </w:r>
           </w:p>
           <w:p>
             <w:pPr>
               <w:pStyle w:val="BodyText"/>
+              <w:tabs>
+                <w:tab w:val="left" w:pos="425"/>
+              </w:tabs>
               <w:jc w:val="both"/>
-              <w:spacing w:before="0" w:after="40" w:line="276" w:lineRule="auto"/>
+              <w:ind w:left="425" w:hanging="425"/>
+              <w:spacing w:before="0" w:after="50" w:line="276" w:lineRule="auto"/>
             </w:pPr>
             <w:r>
-              <w:rPr>
-                <w:rFonts w:ascii="Times New Roman" w:hAnsi="Times New Roman"/>
+              <w:t xml:space="preserve"/>
+              <w:tab/>
+              <w:t/>
+            </w:r>
+            <w:r>
+              <w:rPr>
                 <w:b/>
                 <w:bCs/>
-                <w:sz w:val="24"/>
-                <w:rFonts w:ascii="Times New Roman" w:hAnsi="Times New Roman" w:cs="Times New Roman"/>
               </w:rPr>
               <w:t xml:space="preserve">d)</w:t>
             </w:r>
             <w:r>
-              <w:rPr>
-                <w:rFonts w:ascii="Times New Roman" w:hAnsi="Times New Roman"/>
-                <w:sz w:val="24"/>
-                <w:rFonts w:ascii="Times New Roman" w:hAnsi="Times New Roman" w:cs="Times New Roman"/>
-              </w:rPr>
               <w:t xml:space="preserve"> </w:t>
             </w:r>
             <w:r>
-              <w:rPr>
-                <w:rFonts w:ascii="Times New Roman" w:hAnsi="Times New Roman"/>
-                <w:sz w:val="24"/>
-                <w:rFonts w:ascii="Times New Roman" w:hAnsi="Times New Roman" w:cs="Times New Roman"/>
-              </w:rPr>
               <w:t xml:space="preserve">Độ dài đường gấp khúc</w:t>
             </w:r>
             <w:r>
-              <w:rPr>
-                <w:rFonts w:ascii="Times New Roman" w:hAnsi="Times New Roman"/>
-                <w:sz w:val="24"/>
-                <w:rFonts w:ascii="Times New Roman" w:hAnsi="Times New Roman" w:cs="Times New Roman"/>
-              </w:rPr>
               <w:t xml:space="preserve"> </w:t>
             </w:r>
             <m:oMath>
@@ -7644,27 +7441,12 @@
               </m:r>
             </m:oMath>
             <w:r>
-              <w:rPr>
-                <w:rFonts w:ascii="Times New Roman" w:hAnsi="Times New Roman"/>
-                <w:sz w:val="24"/>
-                <w:rFonts w:ascii="Times New Roman" w:hAnsi="Times New Roman" w:cs="Times New Roman"/>
-              </w:rPr>
               <w:t xml:space="preserve"> </w:t>
             </w:r>
             <w:r>
-              <w:rPr>
-                <w:rFonts w:ascii="Times New Roman" w:hAnsi="Times New Roman"/>
-                <w:sz w:val="24"/>
-                <w:rFonts w:ascii="Times New Roman" w:hAnsi="Times New Roman" w:cs="Times New Roman"/>
-              </w:rPr>
               <w:t xml:space="preserve">bằng</w:t>
             </w:r>
             <w:r>
-              <w:rPr>
-                <w:rFonts w:ascii="Times New Roman" w:hAnsi="Times New Roman"/>
-                <w:sz w:val="24"/>
-                <w:rFonts w:ascii="Times New Roman" w:hAnsi="Times New Roman" w:cs="Times New Roman"/>
-              </w:rPr>
               <w:t xml:space="preserve"> </w:t>
             </w:r>
             <m:oMath>
@@ -7680,11 +7462,6 @@
               </m:r>
             </m:oMath>
             <w:r>
-              <w:rPr>
-                <w:rFonts w:ascii="Times New Roman" w:hAnsi="Times New Roman"/>
-                <w:sz w:val="24"/>
-                <w:rFonts w:ascii="Times New Roman" w:hAnsi="Times New Roman" w:cs="Times New Roman"/>
-              </w:rPr>
               <w:t xml:space="preserve">.</w:t>
             </w:r>
           </w:p>
@@ -7827,41 +7604,32 @@
           <w:p>
             <w:pPr>
               <w:pStyle w:val="BodyText"/>
+              <w:tabs>
+                <w:tab w:val="left" w:pos="425"/>
+              </w:tabs>
               <w:jc w:val="both"/>
-              <w:spacing w:before="0" w:after="40" w:line="276" w:lineRule="auto"/>
+              <w:ind w:left="425" w:hanging="425"/>
+              <w:spacing w:before="0" w:after="50" w:line="276" w:lineRule="auto"/>
             </w:pPr>
             <w:r>
-              <w:rPr>
-                <w:rFonts w:ascii="Times New Roman" w:hAnsi="Times New Roman"/>
+              <w:t xml:space="preserve"/>
+              <w:tab/>
+              <w:t/>
+            </w:r>
+            <w:r>
+              <w:rPr>
                 <w:b/>
                 <w:bCs/>
-                <w:sz w:val="24"/>
-                <w:rFonts w:ascii="Times New Roman" w:hAnsi="Times New Roman" w:cs="Times New Roman"/>
               </w:rPr>
               <w:t xml:space="preserve">a)</w:t>
             </w:r>
             <w:r>
-              <w:rPr>
-                <w:rFonts w:ascii="Times New Roman" w:hAnsi="Times New Roman"/>
-                <w:sz w:val="24"/>
-                <w:rFonts w:ascii="Times New Roman" w:hAnsi="Times New Roman" w:cs="Times New Roman"/>
-              </w:rPr>
               <w:t xml:space="preserve"> </w:t>
             </w:r>
             <w:r>
-              <w:rPr>
-                <w:rFonts w:ascii="Times New Roman" w:hAnsi="Times New Roman"/>
-                <w:sz w:val="24"/>
-                <w:rFonts w:ascii="Times New Roman" w:hAnsi="Times New Roman" w:cs="Times New Roman"/>
-              </w:rPr>
               <w:t xml:space="preserve">Máy bay đang ở độ cao</w:t>
             </w:r>
             <w:r>
-              <w:rPr>
-                <w:rFonts w:ascii="Times New Roman" w:hAnsi="Times New Roman"/>
-                <w:sz w:val="24"/>
-                <w:rFonts w:ascii="Times New Roman" w:hAnsi="Times New Roman" w:cs="Times New Roman"/>
-              </w:rPr>
               <w:t xml:space="preserve"> </w:t>
             </w:r>
             <m:oMath>
@@ -7877,52 +7645,38 @@
               </m:r>
             </m:oMath>
             <w:r>
-              <w:rPr>
-                <w:rFonts w:ascii="Times New Roman" w:hAnsi="Times New Roman"/>
-                <w:sz w:val="24"/>
-                <w:rFonts w:ascii="Times New Roman" w:hAnsi="Times New Roman" w:cs="Times New Roman"/>
-              </w:rPr>
               <w:t xml:space="preserve">.</w:t>
             </w:r>
           </w:p>
           <w:p>
             <w:pPr>
               <w:pStyle w:val="BodyText"/>
+              <w:tabs>
+                <w:tab w:val="left" w:pos="425"/>
+              </w:tabs>
               <w:jc w:val="both"/>
-              <w:spacing w:before="0" w:after="40" w:line="276" w:lineRule="auto"/>
+              <w:ind w:left="425" w:hanging="425"/>
+              <w:spacing w:before="0" w:after="50" w:line="276" w:lineRule="auto"/>
             </w:pPr>
             <w:r>
-              <w:rPr>
-                <w:rFonts w:ascii="Times New Roman" w:hAnsi="Times New Roman"/>
+              <w:t xml:space="preserve"/>
+              <w:tab/>
+              <w:t/>
+            </w:r>
+            <w:r>
+              <w:rPr>
                 <w:b/>
                 <w:bCs/>
-                <w:sz w:val="24"/>
-                <w:rFonts w:ascii="Times New Roman" w:hAnsi="Times New Roman" w:cs="Times New Roman"/>
               </w:rPr>
               <w:t xml:space="preserve">b)</w:t>
             </w:r>
             <w:r>
-              <w:rPr>
-                <w:rFonts w:ascii="Times New Roman" w:hAnsi="Times New Roman"/>
-                <w:sz w:val="24"/>
-                <w:rFonts w:ascii="Times New Roman" w:hAnsi="Times New Roman" w:cs="Times New Roman"/>
-              </w:rPr>
               <w:t xml:space="preserve"> </w:t>
             </w:r>
             <w:r>
-              <w:rPr>
-                <w:rFonts w:ascii="Times New Roman" w:hAnsi="Times New Roman"/>
-                <w:sz w:val="24"/>
-                <w:rFonts w:ascii="Times New Roman" w:hAnsi="Times New Roman" w:cs="Times New Roman"/>
-              </w:rPr>
               <w:t xml:space="preserve">Tọa độ của máy bay</w:t>
             </w:r>
             <w:r>
-              <w:rPr>
-                <w:rFonts w:ascii="Times New Roman" w:hAnsi="Times New Roman"/>
-                <w:sz w:val="24"/>
-                <w:rFonts w:ascii="Times New Roman" w:hAnsi="Times New Roman" w:cs="Times New Roman"/>
-              </w:rPr>
               <w:t xml:space="preserve"> </w:t>
             </w:r>
             <m:oMath>
@@ -7961,52 +7715,38 @@
               </m:r>
             </m:oMath>
             <w:r>
-              <w:rPr>
-                <w:rFonts w:ascii="Times New Roman" w:hAnsi="Times New Roman"/>
-                <w:sz w:val="24"/>
-                <w:rFonts w:ascii="Times New Roman" w:hAnsi="Times New Roman" w:cs="Times New Roman"/>
-              </w:rPr>
               <w:t xml:space="preserve">.</w:t>
             </w:r>
           </w:p>
           <w:p>
             <w:pPr>
               <w:pStyle w:val="BodyText"/>
+              <w:tabs>
+                <w:tab w:val="left" w:pos="425"/>
+              </w:tabs>
               <w:jc w:val="both"/>
-              <w:spacing w:before="0" w:after="40" w:line="276" w:lineRule="auto"/>
+              <w:ind w:left="425" w:hanging="425"/>
+              <w:spacing w:before="0" w:after="50" w:line="276" w:lineRule="auto"/>
             </w:pPr>
             <w:r>
-              <w:rPr>
-                <w:rFonts w:ascii="Times New Roman" w:hAnsi="Times New Roman"/>
+              <w:t xml:space="preserve"/>
+              <w:tab/>
+              <w:t/>
+            </w:r>
+            <w:r>
+              <w:rPr>
                 <w:b/>
                 <w:bCs/>
-                <w:sz w:val="24"/>
-                <w:rFonts w:ascii="Times New Roman" w:hAnsi="Times New Roman" w:cs="Times New Roman"/>
               </w:rPr>
               <w:t xml:space="preserve">c)</w:t>
             </w:r>
             <w:r>
-              <w:rPr>
-                <w:rFonts w:ascii="Times New Roman" w:hAnsi="Times New Roman"/>
-                <w:sz w:val="24"/>
-                <w:rFonts w:ascii="Times New Roman" w:hAnsi="Times New Roman" w:cs="Times New Roman"/>
-              </w:rPr>
               <w:t xml:space="preserve"> </w:t>
             </w:r>
             <w:r>
-              <w:rPr>
-                <w:rFonts w:ascii="Times New Roman" w:hAnsi="Times New Roman"/>
-                <w:sz w:val="24"/>
-                <w:rFonts w:ascii="Times New Roman" w:hAnsi="Times New Roman" w:cs="Times New Roman"/>
-              </w:rPr>
               <w:t xml:space="preserve">Phi công để máy bay ở chế độ tự động với vận tốc theo hướng đông là</w:t>
             </w:r>
             <w:r>
-              <w:rPr>
-                <w:rFonts w:ascii="Times New Roman" w:hAnsi="Times New Roman"/>
-                <w:sz w:val="24"/>
-                <w:rFonts w:ascii="Times New Roman" w:hAnsi="Times New Roman" w:cs="Times New Roman"/>
-              </w:rPr>
               <w:t xml:space="preserve"> </w:t>
             </w:r>
             <m:oMath>
@@ -8022,19 +7762,9 @@
               </m:r>
             </m:oMath>
             <w:r>
-              <w:rPr>
-                <w:rFonts w:ascii="Times New Roman" w:hAnsi="Times New Roman"/>
-                <w:sz w:val="24"/>
-                <w:rFonts w:ascii="Times New Roman" w:hAnsi="Times New Roman" w:cs="Times New Roman"/>
-              </w:rPr>
               <w:t xml:space="preserve">, độ cao không đổi. Biết rằng gió thổi theo hướng đông với vận tốc</w:t>
             </w:r>
             <w:r>
-              <w:rPr>
-                <w:rFonts w:ascii="Times New Roman" w:hAnsi="Times New Roman"/>
-                <w:sz w:val="24"/>
-                <w:rFonts w:ascii="Times New Roman" w:hAnsi="Times New Roman" w:cs="Times New Roman"/>
-              </w:rPr>
               <w:t xml:space="preserve"> </w:t>
             </w:r>
             <m:oMath>
@@ -8050,19 +7780,9 @@
               </m:r>
             </m:oMath>
             <w:r>
-              <w:rPr>
-                <w:rFonts w:ascii="Times New Roman" w:hAnsi="Times New Roman"/>
-                <w:sz w:val="24"/>
-                <w:rFonts w:ascii="Times New Roman" w:hAnsi="Times New Roman" w:cs="Times New Roman"/>
-              </w:rPr>
               <w:t xml:space="preserve">. Giả sử vận tốc và hướng gió không đổi thì lúc 10h30 phút máy bay ở tọa độ</w:t>
             </w:r>
             <w:r>
-              <w:rPr>
-                <w:rFonts w:ascii="Times New Roman" w:hAnsi="Times New Roman"/>
-                <w:sz w:val="24"/>
-                <w:rFonts w:ascii="Times New Roman" w:hAnsi="Times New Roman" w:cs="Times New Roman"/>
-              </w:rPr>
               <w:t xml:space="preserve"> </w:t>
             </w:r>
             <m:oMath>
@@ -8101,52 +7821,38 @@
               </m:r>
             </m:oMath>
             <w:r>
-              <w:rPr>
-                <w:rFonts w:ascii="Times New Roman" w:hAnsi="Times New Roman"/>
-                <w:sz w:val="24"/>
-                <w:rFonts w:ascii="Times New Roman" w:hAnsi="Times New Roman" w:cs="Times New Roman"/>
-              </w:rPr>
               <w:t xml:space="preserve">.</w:t>
             </w:r>
           </w:p>
           <w:p>
             <w:pPr>
               <w:pStyle w:val="BodyText"/>
+              <w:tabs>
+                <w:tab w:val="left" w:pos="425"/>
+              </w:tabs>
               <w:jc w:val="both"/>
-              <w:spacing w:before="0" w:after="40" w:line="276" w:lineRule="auto"/>
+              <w:ind w:left="425" w:hanging="425"/>
+              <w:spacing w:before="0" w:after="50" w:line="276" w:lineRule="auto"/>
             </w:pPr>
             <w:r>
-              <w:rPr>
-                <w:rFonts w:ascii="Times New Roman" w:hAnsi="Times New Roman"/>
+              <w:t xml:space="preserve"/>
+              <w:tab/>
+              <w:t/>
+            </w:r>
+            <w:r>
+              <w:rPr>
                 <w:b/>
                 <w:bCs/>
-                <w:sz w:val="24"/>
-                <w:rFonts w:ascii="Times New Roman" w:hAnsi="Times New Roman" w:cs="Times New Roman"/>
               </w:rPr>
               <w:t xml:space="preserve">d)</w:t>
             </w:r>
             <w:r>
-              <w:rPr>
-                <w:rFonts w:ascii="Times New Roman" w:hAnsi="Times New Roman"/>
-                <w:sz w:val="24"/>
-                <w:rFonts w:ascii="Times New Roman" w:hAnsi="Times New Roman" w:cs="Times New Roman"/>
-              </w:rPr>
               <w:t xml:space="preserve"> </w:t>
             </w:r>
             <w:r>
-              <w:rPr>
-                <w:rFonts w:ascii="Times New Roman" w:hAnsi="Times New Roman"/>
-                <w:sz w:val="24"/>
-                <w:rFonts w:ascii="Times New Roman" w:hAnsi="Times New Roman" w:cs="Times New Roman"/>
-              </w:rPr>
               <w:t xml:space="preserve">Sau khi bay đến vị trí lúc 10h30 thì máy bay bay theo hướng ngược lại với vận tốc</w:t>
             </w:r>
             <w:r>
-              <w:rPr>
-                <w:rFonts w:ascii="Times New Roman" w:hAnsi="Times New Roman"/>
-                <w:sz w:val="24"/>
-                <w:rFonts w:ascii="Times New Roman" w:hAnsi="Times New Roman" w:cs="Times New Roman"/>
-              </w:rPr>
               <w:t xml:space="preserve"> </w:t>
             </w:r>
             <m:oMath>
@@ -8162,27 +7868,12 @@
               </m:r>
             </m:oMath>
             <w:r>
-              <w:rPr>
-                <w:rFonts w:ascii="Times New Roman" w:hAnsi="Times New Roman"/>
-                <w:sz w:val="24"/>
-                <w:rFonts w:ascii="Times New Roman" w:hAnsi="Times New Roman" w:cs="Times New Roman"/>
-              </w:rPr>
               <w:t xml:space="preserve"> </w:t>
             </w:r>
             <w:r>
-              <w:rPr>
-                <w:rFonts w:ascii="Times New Roman" w:hAnsi="Times New Roman"/>
-                <w:sz w:val="24"/>
-                <w:rFonts w:ascii="Times New Roman" w:hAnsi="Times New Roman" w:cs="Times New Roman"/>
-              </w:rPr>
               <w:t xml:space="preserve">với độ cao không đổi, biết lúc đó trời lặng gió thì lúc 11h máy bay ở tọa độ</w:t>
             </w:r>
             <w:r>
-              <w:rPr>
-                <w:rFonts w:ascii="Times New Roman" w:hAnsi="Times New Roman"/>
-                <w:sz w:val="24"/>
-                <w:rFonts w:ascii="Times New Roman" w:hAnsi="Times New Roman" w:cs="Times New Roman"/>
-              </w:rPr>
               <w:t xml:space="preserve"> </w:t>
             </w:r>
             <m:oMath>
@@ -8221,11 +7912,6 @@
               </m:r>
             </m:oMath>
             <w:r>
-              <w:rPr>
-                <w:rFonts w:ascii="Times New Roman" w:hAnsi="Times New Roman"/>
-                <w:sz w:val="24"/>
-                <w:rFonts w:ascii="Times New Roman" w:hAnsi="Times New Roman" w:cs="Times New Roman"/>
-              </w:rPr>
               <w:t xml:space="preserve">.</w:t>
             </w:r>
           </w:p>
@@ -8749,41 +8435,32 @@
     <w:p>
       <w:pPr>
         <w:pStyle w:val="BodyText"/>
+        <w:tabs>
+          <w:tab w:val="left" w:pos="425"/>
+        </w:tabs>
         <w:jc w:val="both"/>
-        <w:spacing w:before="0" w:after="40" w:line="276" w:lineRule="auto"/>
+        <w:ind w:left="425" w:hanging="425"/>
+        <w:spacing w:before="0" w:after="50" w:line="276" w:lineRule="auto"/>
       </w:pPr>
       <w:r>
-        <w:rPr>
-          <w:rFonts w:ascii="Times New Roman" w:hAnsi="Times New Roman"/>
+        <w:t xml:space="preserve"/>
+        <w:tab/>
+        <w:t/>
+      </w:r>
+      <w:r>
+        <w:rPr>
           <w:b/>
           <w:bCs/>
-          <w:sz w:val="24"/>
-          <w:rFonts w:ascii="Times New Roman" w:hAnsi="Times New Roman" w:cs="Times New Roman"/>
         </w:rPr>
         <w:t xml:space="preserve">a)</w:t>
       </w:r>
       <w:r>
-        <w:rPr>
-          <w:rFonts w:ascii="Times New Roman" w:hAnsi="Times New Roman"/>
-          <w:sz w:val="24"/>
-          <w:rFonts w:ascii="Times New Roman" w:hAnsi="Times New Roman" w:cs="Times New Roman"/>
-        </w:rPr>
-        <w:t xml:space="preserve"> </w:t>
-      </w:r>
-      <w:r>
-        <w:rPr>
-          <w:rFonts w:ascii="Times New Roman" w:hAnsi="Times New Roman"/>
-          <w:sz w:val="24"/>
-          <w:rFonts w:ascii="Times New Roman" w:hAnsi="Times New Roman" w:cs="Times New Roman"/>
-        </w:rPr>
+        <w:t xml:space="preserve"> </w:t>
+      </w:r>
+      <w:r>
         <w:t xml:space="preserve">Gọi</w:t>
       </w:r>
       <w:r>
-        <w:rPr>
-          <w:rFonts w:ascii="Times New Roman" w:hAnsi="Times New Roman"/>
-          <w:sz w:val="24"/>
-          <w:rFonts w:ascii="Times New Roman" w:hAnsi="Times New Roman" w:cs="Times New Roman"/>
-        </w:rPr>
         <w:t xml:space="preserve"> </w:t>
       </w:r>
       <m:oMath>
@@ -8849,27 +8526,12 @@
         </m:sSub>
       </m:oMath>
       <w:r>
-        <w:rPr>
-          <w:rFonts w:ascii="Times New Roman" w:hAnsi="Times New Roman"/>
-          <w:sz w:val="24"/>
-          <w:rFonts w:ascii="Times New Roman" w:hAnsi="Times New Roman" w:cs="Times New Roman"/>
-        </w:rPr>
-        <w:t xml:space="preserve"> </w:t>
-      </w:r>
-      <w:r>
-        <w:rPr>
-          <w:rFonts w:ascii="Times New Roman" w:hAnsi="Times New Roman"/>
-          <w:sz w:val="24"/>
-          <w:rFonts w:ascii="Times New Roman" w:hAnsi="Times New Roman" w:cs="Times New Roman"/>
-        </w:rPr>
+        <w:t xml:space="preserve"> </w:t>
+      </w:r>
+      <w:r>
         <w:t xml:space="preserve">là mẫu số liệu gốc gồm chiều cao của 20 học sinh trên được xếp theo thứ tự không giảm. Khi đó,</w:t>
       </w:r>
       <w:r>
-        <w:rPr>
-          <w:rFonts w:ascii="Times New Roman" w:hAnsi="Times New Roman"/>
-          <w:sz w:val="24"/>
-          <w:rFonts w:ascii="Times New Roman" w:hAnsi="Times New Roman" w:cs="Times New Roman"/>
-        </w:rPr>
         <w:t xml:space="preserve"> </w:t>
       </w:r>
       <m:oMath>
@@ -8917,27 +8579,12 @@
         </m:r>
       </m:oMath>
       <w:r>
-        <w:rPr>
-          <w:rFonts w:ascii="Times New Roman" w:hAnsi="Times New Roman"/>
-          <w:sz w:val="24"/>
-          <w:rFonts w:ascii="Times New Roman" w:hAnsi="Times New Roman" w:cs="Times New Roman"/>
-        </w:rPr>
-        <w:t xml:space="preserve"> </w:t>
-      </w:r>
-      <w:r>
-        <w:rPr>
-          <w:rFonts w:ascii="Times New Roman" w:hAnsi="Times New Roman"/>
-          <w:sz w:val="24"/>
-          <w:rFonts w:ascii="Times New Roman" w:hAnsi="Times New Roman" w:cs="Times New Roman"/>
-        </w:rPr>
+        <w:t xml:space="preserve"> </w:t>
+      </w:r>
+      <w:r>
         <w:t xml:space="preserve">và</w:t>
       </w:r>
       <w:r>
-        <w:rPr>
-          <w:rFonts w:ascii="Times New Roman" w:hAnsi="Times New Roman"/>
-          <w:sz w:val="24"/>
-          <w:rFonts w:ascii="Times New Roman" w:hAnsi="Times New Roman" w:cs="Times New Roman"/>
-        </w:rPr>
         <w:t xml:space="preserve"> </w:t>
       </w:r>
       <m:oMath>
@@ -8985,52 +8632,38 @@
         </m:r>
       </m:oMath>
       <w:r>
-        <w:rPr>
-          <w:rFonts w:ascii="Times New Roman" w:hAnsi="Times New Roman"/>
-          <w:sz w:val="24"/>
-          <w:rFonts w:ascii="Times New Roman" w:hAnsi="Times New Roman" w:cs="Times New Roman"/>
-        </w:rPr>
         <w:t xml:space="preserve">.</w:t>
       </w:r>
     </w:p>
     <w:p>
       <w:pPr>
         <w:pStyle w:val="BodyText"/>
+        <w:tabs>
+          <w:tab w:val="left" w:pos="425"/>
+        </w:tabs>
         <w:jc w:val="both"/>
-        <w:spacing w:before="0" w:after="40" w:line="276" w:lineRule="auto"/>
+        <w:ind w:left="425" w:hanging="425"/>
+        <w:spacing w:before="0" w:after="50" w:line="276" w:lineRule="auto"/>
       </w:pPr>
       <w:r>
-        <w:rPr>
-          <w:rFonts w:ascii="Times New Roman" w:hAnsi="Times New Roman"/>
+        <w:t xml:space="preserve"/>
+        <w:tab/>
+        <w:t/>
+      </w:r>
+      <w:r>
+        <w:rPr>
           <w:b/>
           <w:bCs/>
-          <w:sz w:val="24"/>
-          <w:rFonts w:ascii="Times New Roman" w:hAnsi="Times New Roman" w:cs="Times New Roman"/>
         </w:rPr>
         <w:t xml:space="preserve">b)</w:t>
       </w:r>
       <w:r>
-        <w:rPr>
-          <w:rFonts w:ascii="Times New Roman" w:hAnsi="Times New Roman"/>
-          <w:sz w:val="24"/>
-          <w:rFonts w:ascii="Times New Roman" w:hAnsi="Times New Roman" w:cs="Times New Roman"/>
-        </w:rPr>
-        <w:t xml:space="preserve"> </w:t>
-      </w:r>
-      <w:r>
-        <w:rPr>
-          <w:rFonts w:ascii="Times New Roman" w:hAnsi="Times New Roman"/>
-          <w:sz w:val="24"/>
-          <w:rFonts w:ascii="Times New Roman" w:hAnsi="Times New Roman" w:cs="Times New Roman"/>
-        </w:rPr>
+        <w:t xml:space="preserve"> </w:t>
+      </w:r>
+      <w:r>
         <w:t xml:space="preserve">Tứ phân vị thứ ba của mẫu số liệu ghép nhóm đã cho bằng</w:t>
       </w:r>
       <w:r>
-        <w:rPr>
-          <w:rFonts w:ascii="Times New Roman" w:hAnsi="Times New Roman"/>
-          <w:sz w:val="24"/>
-          <w:rFonts w:ascii="Times New Roman" w:hAnsi="Times New Roman" w:cs="Times New Roman"/>
-        </w:rPr>
         <w:t xml:space="preserve"> </w:t>
       </w:r>
       <m:oMath>
@@ -9039,52 +8672,38 @@
         </m:r>
       </m:oMath>
       <w:r>
-        <w:rPr>
-          <w:rFonts w:ascii="Times New Roman" w:hAnsi="Times New Roman"/>
-          <w:sz w:val="24"/>
-          <w:rFonts w:ascii="Times New Roman" w:hAnsi="Times New Roman" w:cs="Times New Roman"/>
-        </w:rPr>
         <w:t xml:space="preserve">.</w:t>
       </w:r>
     </w:p>
     <w:p>
       <w:pPr>
         <w:pStyle w:val="BodyText"/>
+        <w:tabs>
+          <w:tab w:val="left" w:pos="425"/>
+        </w:tabs>
         <w:jc w:val="both"/>
-        <w:spacing w:before="0" w:after="40" w:line="276" w:lineRule="auto"/>
+        <w:ind w:left="425" w:hanging="425"/>
+        <w:spacing w:before="0" w:after="50" w:line="276" w:lineRule="auto"/>
       </w:pPr>
       <w:r>
-        <w:rPr>
-          <w:rFonts w:ascii="Times New Roman" w:hAnsi="Times New Roman"/>
+        <w:t xml:space="preserve"/>
+        <w:tab/>
+        <w:t/>
+      </w:r>
+      <w:r>
+        <w:rPr>
           <w:b/>
           <w:bCs/>
-          <w:sz w:val="24"/>
-          <w:rFonts w:ascii="Times New Roman" w:hAnsi="Times New Roman" w:cs="Times New Roman"/>
         </w:rPr>
         <w:t xml:space="preserve">c)</w:t>
       </w:r>
       <w:r>
-        <w:rPr>
-          <w:rFonts w:ascii="Times New Roman" w:hAnsi="Times New Roman"/>
-          <w:sz w:val="24"/>
-          <w:rFonts w:ascii="Times New Roman" w:hAnsi="Times New Roman" w:cs="Times New Roman"/>
-        </w:rPr>
-        <w:t xml:space="preserve"> </w:t>
-      </w:r>
-      <w:r>
-        <w:rPr>
-          <w:rFonts w:ascii="Times New Roman" w:hAnsi="Times New Roman"/>
-          <w:sz w:val="24"/>
-          <w:rFonts w:ascii="Times New Roman" w:hAnsi="Times New Roman" w:cs="Times New Roman"/>
-        </w:rPr>
+        <w:t xml:space="preserve"> </w:t>
+      </w:r>
+      <w:r>
         <w:t xml:space="preserve">Khoảng tứ phân vị của mẫu số liệu ghép nhóm đã cho là</w:t>
       </w:r>
       <w:r>
-        <w:rPr>
-          <w:rFonts w:ascii="Times New Roman" w:hAnsi="Times New Roman"/>
-          <w:sz w:val="24"/>
-          <w:rFonts w:ascii="Times New Roman" w:hAnsi="Times New Roman" w:cs="Times New Roman"/>
-        </w:rPr>
         <w:t xml:space="preserve"> </w:t>
       </w:r>
       <m:oMath>
@@ -9153,52 +8772,38 @@
         </m:r>
       </m:oMath>
       <w:r>
-        <w:rPr>
-          <w:rFonts w:ascii="Times New Roman" w:hAnsi="Times New Roman"/>
-          <w:sz w:val="24"/>
-          <w:rFonts w:ascii="Times New Roman" w:hAnsi="Times New Roman" w:cs="Times New Roman"/>
-        </w:rPr>
         <w:t xml:space="preserve">.</w:t>
       </w:r>
     </w:p>
     <w:p>
       <w:pPr>
         <w:pStyle w:val="BodyText"/>
+        <w:tabs>
+          <w:tab w:val="left" w:pos="425"/>
+        </w:tabs>
         <w:jc w:val="both"/>
-        <w:spacing w:before="0" w:after="40" w:line="276" w:lineRule="auto"/>
+        <w:ind w:left="425" w:hanging="425"/>
+        <w:spacing w:before="0" w:after="50" w:line="276" w:lineRule="auto"/>
       </w:pPr>
       <w:r>
-        <w:rPr>
-          <w:rFonts w:ascii="Times New Roman" w:hAnsi="Times New Roman"/>
+        <w:t xml:space="preserve"/>
+        <w:tab/>
+        <w:t/>
+      </w:r>
+      <w:r>
+        <w:rPr>
           <w:b/>
           <w:bCs/>
-          <w:sz w:val="24"/>
-          <w:rFonts w:ascii="Times New Roman" w:hAnsi="Times New Roman" w:cs="Times New Roman"/>
         </w:rPr>
         <w:t xml:space="preserve">d)</w:t>
       </w:r>
       <w:r>
-        <w:rPr>
-          <w:rFonts w:ascii="Times New Roman" w:hAnsi="Times New Roman"/>
-          <w:sz w:val="24"/>
-          <w:rFonts w:ascii="Times New Roman" w:hAnsi="Times New Roman" w:cs="Times New Roman"/>
-        </w:rPr>
-        <w:t xml:space="preserve"> </w:t>
-      </w:r>
-      <w:r>
-        <w:rPr>
-          <w:rFonts w:ascii="Times New Roman" w:hAnsi="Times New Roman"/>
-          <w:sz w:val="24"/>
-          <w:rFonts w:ascii="Times New Roman" w:hAnsi="Times New Roman" w:cs="Times New Roman"/>
-        </w:rPr>
+        <w:t xml:space="preserve"> </w:t>
+      </w:r>
+      <w:r>
         <w:t xml:space="preserve">Chọn ngẫu nhiên một học sinh trong nhóm khảo sát nói trên, xác suất chọn được học sinh có chiều cao từ</w:t>
       </w:r>
       <w:r>
-        <w:rPr>
-          <w:rFonts w:ascii="Times New Roman" w:hAnsi="Times New Roman"/>
-          <w:sz w:val="24"/>
-          <w:rFonts w:ascii="Times New Roman" w:hAnsi="Times New Roman" w:cs="Times New Roman"/>
-        </w:rPr>
         <w:t xml:space="preserve"> </w:t>
       </w:r>
       <m:oMath>
@@ -9214,27 +8819,12 @@
         </m:r>
       </m:oMath>
       <w:r>
-        <w:rPr>
-          <w:rFonts w:ascii="Times New Roman" w:hAnsi="Times New Roman"/>
-          <w:sz w:val="24"/>
-          <w:rFonts w:ascii="Times New Roman" w:hAnsi="Times New Roman" w:cs="Times New Roman"/>
-        </w:rPr>
-        <w:t xml:space="preserve"> </w:t>
-      </w:r>
-      <w:r>
-        <w:rPr>
-          <w:rFonts w:ascii="Times New Roman" w:hAnsi="Times New Roman"/>
-          <w:sz w:val="24"/>
-          <w:rFonts w:ascii="Times New Roman" w:hAnsi="Times New Roman" w:cs="Times New Roman"/>
-        </w:rPr>
+        <w:t xml:space="preserve"> </w:t>
+      </w:r>
+      <w:r>
         <w:t xml:space="preserve">trở lên bằng</w:t>
       </w:r>
       <w:r>
-        <w:rPr>
-          <w:rFonts w:ascii="Times New Roman" w:hAnsi="Times New Roman"/>
-          <w:sz w:val="24"/>
-          <w:rFonts w:ascii="Times New Roman" w:hAnsi="Times New Roman" w:cs="Times New Roman"/>
-        </w:rPr>
         <w:t xml:space="preserve"> </w:t>
       </w:r>
       <m:oMath>
@@ -9252,35 +8842,23 @@
         </m:r>
       </m:oMath>
       <w:r>
-        <w:rPr>
-          <w:rFonts w:ascii="Times New Roman" w:hAnsi="Times New Roman"/>
-          <w:sz w:val="24"/>
-          <w:rFonts w:ascii="Times New Roman" w:hAnsi="Times New Roman" w:cs="Times New Roman"/>
-        </w:rPr>
         <w:t xml:space="preserve">.</w:t>
       </w:r>
     </w:p>
     <w:p>
       <w:pPr>
         <w:spacing w:before="160" w:after="40"/>
+        <w:jc w:val="both"/>
       </w:pPr>
       <w:r>
         <w:rPr>
           <w:rFonts w:ascii="Times New Roman" w:hAnsi="Times New Roman"/>
           <w:b/>
-          <w:color w:val="0050A0"/>
-          <w:sz w:val="24"/>
-          <w:bdr w:val="single" w:sz="8" w:space="3" w:color="0050A0"/>
-          <w:shd w:fill="EDF3F8"/>
-          <w:rFonts w:ascii="Times New Roman" w:hAnsi="Times New Roman" w:cs="Times New Roman"/>
-        </w:rPr>
-        <w:t xml:space="preserve">  PHẦN 3. Câu trắc nghiệm trả lời ngắn  </w:t>
-      </w:r>
-    </w:p>
-    <w:p>
-      <w:pPr>
-        <w:spacing w:before="0" w:after="80"/>
-      </w:pPr>
+          <w:sz w:val="24"/>
+          <w:rFonts w:ascii="Times New Roman" w:hAnsi="Times New Roman" w:cs="Times New Roman"/>
+        </w:rPr>
+        <w:t>PHẦN III. Câu trắc nghiệm yêu cầu trả lời ngắn.</w:t>
+      </w:r>
       <w:r>
         <w:rPr>
           <w:rFonts w:ascii="Times New Roman" w:hAnsi="Times New Roman"/>
@@ -9288,7 +8866,7 @@
           <w:sz w:val="24"/>
           <w:rFonts w:ascii="Times New Roman" w:hAnsi="Times New Roman" w:cs="Times New Roman"/>
         </w:rPr>
-        <w:t>Thí sinh trả lời từ câu 1 đến câu 6.</w:t>
+        <w:t xml:space="preserve"> Thí sinh trả lời từ câu 1 đến câu 6.</w:t>
       </w:r>
     </w:p>
     <w:p>
@@ -9660,12 +9238,20 @@
         </w:trPr>
         <w:tc>
           <w:tcPr>
-            <w:tcW w:type="dxa" w:w="624"/>
+            <w:tcW w:type="dxa" w:w="1020"/>
           </w:tcPr>
           <w:p>
             <w:pPr>
               <w:spacing w:before="0" w:after="0"/>
             </w:pPr>
+            <w:r>
+              <w:rPr>
+                <w:rFonts w:ascii="Times New Roman" w:hAnsi="Times New Roman"/>
+                <w:sz w:val="24"/>
+                <w:rFonts w:ascii="Times New Roman" w:hAnsi="Times New Roman" w:cs="Times New Roman"/>
+              </w:rPr>
+              <w:tab/>
+            </w:r>
             <w:r>
               <w:rPr>
                 <w:rFonts w:ascii="Times New Roman" w:hAnsi="Times New Roman"/>
@@ -9877,12 +9463,15 @@
               </w:trPr>
               <w:tc>
                 <w:tcPr>
-                  <w:tcW w:type="dxa" w:w="624"/>
+                  <w:tcW w:type="dxa" w:w="1020"/>
                 </w:tcPr>
                 <w:p>
                   <w:pPr>
                     <w:spacing w:before="0" w:after="0"/>
                   </w:pPr>
+                  <w:r>
+                    <w:tab/>
+                  </w:r>
                   <w:r>
                     <w:rPr>
                       <w:rFonts w:ascii="Times New Roman" w:hAnsi="Times New Roman"/>
@@ -10464,12 +10053,20 @@
         </w:trPr>
         <w:tc>
           <w:tcPr>
-            <w:tcW w:type="dxa" w:w="624"/>
+            <w:tcW w:type="dxa" w:w="1020"/>
           </w:tcPr>
           <w:p>
             <w:pPr>
               <w:spacing w:before="0" w:after="0"/>
             </w:pPr>
+            <w:r>
+              <w:rPr>
+                <w:rFonts w:ascii="Times New Roman" w:hAnsi="Times New Roman"/>
+                <w:sz w:val="24"/>
+                <w:rFonts w:ascii="Times New Roman" w:hAnsi="Times New Roman" w:cs="Times New Roman"/>
+              </w:rPr>
+              <w:tab/>
+            </w:r>
             <w:r>
               <w:rPr>
                 <w:rFonts w:ascii="Times New Roman" w:hAnsi="Times New Roman"/>
@@ -10951,12 +10548,20 @@
         </w:trPr>
         <w:tc>
           <w:tcPr>
-            <w:tcW w:type="dxa" w:w="624"/>
+            <w:tcW w:type="dxa" w:w="1020"/>
           </w:tcPr>
           <w:p>
             <w:pPr>
               <w:spacing w:before="0" w:after="0"/>
             </w:pPr>
+            <w:r>
+              <w:rPr>
+                <w:rFonts w:ascii="Times New Roman" w:hAnsi="Times New Roman"/>
+                <w:sz w:val="24"/>
+                <w:rFonts w:ascii="Times New Roman" w:hAnsi="Times New Roman" w:cs="Times New Roman"/>
+              </w:rPr>
+              <w:tab/>
+            </w:r>
             <w:r>
               <w:rPr>
                 <w:rFonts w:ascii="Times New Roman" w:hAnsi="Times New Roman"/>
@@ -11513,12 +11118,20 @@
         </w:trPr>
         <w:tc>
           <w:tcPr>
-            <w:tcW w:type="dxa" w:w="624"/>
+            <w:tcW w:type="dxa" w:w="1020"/>
           </w:tcPr>
           <w:p>
             <w:pPr>
               <w:spacing w:before="0" w:after="0"/>
             </w:pPr>
+            <w:r>
+              <w:rPr>
+                <w:rFonts w:ascii="Times New Roman" w:hAnsi="Times New Roman"/>
+                <w:sz w:val="24"/>
+                <w:rFonts w:ascii="Times New Roman" w:hAnsi="Times New Roman" w:cs="Times New Roman"/>
+              </w:rPr>
+              <w:tab/>
+            </w:r>
             <w:r>
               <w:rPr>
                 <w:rFonts w:ascii="Times New Roman" w:hAnsi="Times New Roman"/>
@@ -12055,12 +11668,20 @@
         </w:trPr>
         <w:tc>
           <w:tcPr>
-            <w:tcW w:type="dxa" w:w="624"/>
+            <w:tcW w:type="dxa" w:w="1020"/>
           </w:tcPr>
           <w:p>
             <w:pPr>
               <w:spacing w:before="0" w:after="0"/>
             </w:pPr>
+            <w:r>
+              <w:rPr>
+                <w:rFonts w:ascii="Times New Roman" w:hAnsi="Times New Roman"/>
+                <w:sz w:val="24"/>
+                <w:rFonts w:ascii="Times New Roman" w:hAnsi="Times New Roman" w:cs="Times New Roman"/>
+              </w:rPr>
+              <w:tab/>
+            </w:r>
             <w:r>
               <w:rPr>
                 <w:rFonts w:ascii="Times New Roman" w:hAnsi="Times New Roman"/>
@@ -12144,7 +11765,7 @@
           <w:sz w:val="24"/>
           <w:rFonts w:ascii="Times New Roman" w:hAnsi="Times New Roman" w:cs="Times New Roman"/>
         </w:rPr>
-        <w:t xml:space="preserve">———- HẾT ———-</w:t>
+        <w:t xml:space="preserve">—— HẾT ——</w:t>
       </w:r>
     </w:p>
     <w:sectPr>

</xml_diff>

<commit_message>
Update optimized header and eliminate all unwanted bottom horizontal lines in Word and TeX
</commit_message>
<xml_diff>
--- a/pdf2word/San_Pham/De_Thi_2009.docx
+++ b/pdf2word/San_Pham/De_Thi_2009.docx
@@ -24,11 +24,12 @@
       <w:tr>
         <w:tc>
           <w:tcPr>
-            <w:tcW w:type="dxa" w:w="5386"/>
+            <w:tcW w:type="dxa" w:w="5556"/>
+            <w:vAlign w:val="center"/>
           </w:tcPr>
           <w:p>
             <w:pPr>
-              <w:spacing w:line="276" w:lineRule="auto" w:before="40" w:after="40"/>
+              <w:spacing w:line="276" w:lineRule="auto" w:before="60" w:after="60"/>
               <w:jc w:val="center"/>
             </w:pPr>
             <w:r>
@@ -48,20 +49,21 @@
                 <w:sz w:val="24"/>
                 <w:rFonts w:ascii="Times New Roman" w:hAnsi="Times New Roman" w:cs="Times New Roman"/>
               </w:rPr>
-              <w:t>SĐT: 0935.322.328  •  50/2C Phạm Thị Liên</w:t>
+              <w:t>SĐT: 0935.322.328</w:t>
               <w:br/>
-              <w:t>--------------------</w:t>
+              <w:t>Địa chỉ: 50/2C Phạm Thị Liên</w:t>
             </w:r>
           </w:p>
         </w:tc>
         <w:tc>
           <w:tcPr>
-            <w:tcW w:type="dxa" w:w="4535"/>
+            <w:tcW w:type="dxa" w:w="4365"/>
             <w:gridSpan w:val="2"/>
+            <w:vAlign w:val="center"/>
           </w:tcPr>
           <w:p>
             <w:pPr>
-              <w:spacing w:line="276" w:lineRule="auto" w:before="40" w:after="40"/>
+              <w:spacing w:line="276" w:lineRule="auto" w:before="60" w:after="60"/>
               <w:jc w:val="center"/>
             </w:pPr>
             <w:r>
@@ -73,7 +75,7 @@
                 <w:rFonts w:ascii="Times New Roman" w:hAnsi="Times New Roman" w:cs="Times New Roman"/>
                 <w:rFonts w:ascii="Times New Roman" w:hAnsi="Times New Roman" w:cs="Times New Roman"/>
               </w:rPr>
-              <w:t>ĐỀ ÔN TẬP TOÁN -- KHỐI LỚP: 12</w:t>
+              <w:t>ĐỀ ÔN TẬP TOÁN -- LỚP: 12</w:t>
               <w:br/>
             </w:r>
             <w:r>
@@ -84,7 +86,7 @@
                 <w:rFonts w:ascii="Times New Roman" w:hAnsi="Times New Roman" w:cs="Times New Roman"/>
                 <w:rFonts w:ascii="Times New Roman" w:hAnsi="Times New Roman" w:cs="Times New Roman"/>
               </w:rPr>
-              <w:t>Thời gian làm bài: 90 phút (không kể phát đề)</w:t>
+              <w:t>Thời gian làm bài: 90 phút</w:t>
             </w:r>
           </w:p>
         </w:tc>
@@ -92,11 +94,12 @@
       <w:tr>
         <w:tc>
           <w:tcPr>
-            <w:tcW w:type="dxa" w:w="5953"/>
+            <w:tcW w:type="dxa" w:w="5783"/>
+            <w:vAlign w:val="center"/>
           </w:tcPr>
           <w:p>
             <w:pPr>
-              <w:spacing w:before="40" w:after="40"/>
+              <w:spacing w:before="60" w:after="60"/>
             </w:pPr>
             <w:r>
               <w:rPr>
@@ -110,11 +113,12 @@
         </w:tc>
         <w:tc>
           <w:tcPr>
-            <w:tcW w:type="dxa" w:w="2268"/>
+            <w:tcW w:type="dxa" w:w="2438"/>
+            <w:vAlign w:val="center"/>
           </w:tcPr>
           <w:p>
             <w:pPr>
-              <w:spacing w:before="40" w:after="40"/>
+              <w:spacing w:before="60" w:after="60"/>
             </w:pPr>
             <w:r>
               <w:rPr>
@@ -129,10 +133,11 @@
         <w:tc>
           <w:tcPr>
             <w:tcW w:type="dxa" w:w="1701"/>
+            <w:vAlign w:val="center"/>
           </w:tcPr>
           <w:p>
             <w:pPr>
-              <w:spacing w:before="40" w:after="40"/>
+              <w:spacing w:before="60" w:after="60"/>
               <w:jc w:val="center"/>
             </w:pPr>
             <w:r>
@@ -1858,7 +1863,6 @@
       <w:tblPr>
         <w:tblW w:type="auto" w:w="0"/>
         <w:jc w:val="center"/>
-        <w:tblLook w:firstColumn="1" w:firstRow="1" w:lastColumn="0" w:lastRow="0" w:noHBand="0" w:noVBand="1" w:val="04A0"/>
         <w:tblBorders>
           <w:top w:val="none"/>
           <w:left w:val="none"/>
@@ -1867,6 +1871,7 @@
           <w:insideH w:val="none"/>
           <w:insideV w:val="none"/>
         </w:tblBorders>
+        <w:tblLook w:val="0000" w:firstRow="0" w:lastRow="0" w:firstColumn="0" w:lastColumn="0" w:noHBand="0" w:noVBand="0"/>
       </w:tblPr>
       <w:tblGrid>
         <w:gridCol w:w="4961"/>
@@ -1877,6 +1882,12 @@
           <w:tcPr>
             <w:tcW w:type="dxa" w:w="6690"/>
             <w:vAlign w:val="center"/>
+            <w:tcBorders>
+              <w:top w:val="none"/>
+              <w:left w:val="none"/>
+              <w:bottom w:val="none"/>
+              <w:right w:val="none"/>
+            </w:tcBorders>
           </w:tcPr>
           <w:p>
             <w:pPr>
@@ -2229,6 +2240,12 @@
           <w:tcPr>
             <w:tcW w:type="dxa" w:w="3231"/>
             <w:vAlign w:val="center"/>
+            <w:tcBorders>
+              <w:top w:val="none"/>
+              <w:left w:val="none"/>
+              <w:bottom w:val="none"/>
+              <w:right w:val="none"/>
+            </w:tcBorders>
           </w:tcPr>
           <w:p>
             <w:pPr>
@@ -3597,7 +3614,6 @@
       <w:tblPr>
         <w:tblW w:type="auto" w:w="0"/>
         <w:jc w:val="center"/>
-        <w:tblLook w:firstColumn="1" w:firstRow="1" w:lastColumn="0" w:lastRow="0" w:noHBand="0" w:noVBand="1" w:val="04A0"/>
         <w:tblBorders>
           <w:top w:val="none"/>
           <w:left w:val="none"/>
@@ -3606,6 +3622,7 @@
           <w:insideH w:val="none"/>
           <w:insideV w:val="none"/>
         </w:tblBorders>
+        <w:tblLook w:val="0000" w:firstRow="0" w:lastRow="0" w:firstColumn="0" w:lastColumn="0" w:noHBand="0" w:noVBand="0"/>
       </w:tblPr>
       <w:tblGrid>
         <w:gridCol w:w="4961"/>
@@ -3616,6 +3633,12 @@
           <w:tcPr>
             <w:tcW w:type="dxa" w:w="6690"/>
             <w:vAlign w:val="center"/>
+            <w:tcBorders>
+              <w:top w:val="none"/>
+              <w:left w:val="none"/>
+              <w:bottom w:val="none"/>
+              <w:right w:val="none"/>
+            </w:tcBorders>
           </w:tcPr>
           <w:p>
             <w:pPr>
@@ -4077,6 +4100,12 @@
           <w:tcPr>
             <w:tcW w:type="dxa" w:w="3231"/>
             <w:vAlign w:val="center"/>
+            <w:tcBorders>
+              <w:top w:val="none"/>
+              <w:left w:val="none"/>
+              <w:bottom w:val="none"/>
+              <w:right w:val="none"/>
+            </w:tcBorders>
           </w:tcPr>
           <w:p>
             <w:pPr>
@@ -6571,7 +6600,6 @@
       <w:tblPr>
         <w:tblW w:type="auto" w:w="0"/>
         <w:jc w:val="center"/>
-        <w:tblLook w:firstColumn="1" w:firstRow="1" w:lastColumn="0" w:lastRow="0" w:noHBand="0" w:noVBand="1" w:val="04A0"/>
         <w:tblBorders>
           <w:top w:val="none"/>
           <w:left w:val="none"/>
@@ -6580,6 +6608,7 @@
           <w:insideH w:val="none"/>
           <w:insideV w:val="none"/>
         </w:tblBorders>
+        <w:tblLook w:val="0000" w:firstRow="0" w:lastRow="0" w:firstColumn="0" w:lastColumn="0" w:noHBand="0" w:noVBand="0"/>
       </w:tblPr>
       <w:tblGrid>
         <w:gridCol w:w="4961"/>
@@ -6590,6 +6619,12 @@
           <w:tcPr>
             <w:tcW w:type="dxa" w:w="6690"/>
             <w:vAlign w:val="center"/>
+            <w:tcBorders>
+              <w:top w:val="none"/>
+              <w:left w:val="none"/>
+              <w:bottom w:val="none"/>
+              <w:right w:val="none"/>
+            </w:tcBorders>
           </w:tcPr>
           <w:p>
             <w:pPr>
@@ -7470,6 +7505,12 @@
           <w:tcPr>
             <w:tcW w:type="dxa" w:w="3231"/>
             <w:vAlign w:val="center"/>
+            <w:tcBorders>
+              <w:top w:val="none"/>
+              <w:left w:val="none"/>
+              <w:bottom w:val="none"/>
+              <w:right w:val="none"/>
+            </w:tcBorders>
           </w:tcPr>
           <w:p>
             <w:pPr>
@@ -7523,7 +7564,6 @@
       <w:tblPr>
         <w:tblW w:type="auto" w:w="0"/>
         <w:jc w:val="center"/>
-        <w:tblLook w:firstColumn="1" w:firstRow="1" w:lastColumn="0" w:lastRow="0" w:noHBand="0" w:noVBand="1" w:val="04A0"/>
         <w:tblBorders>
           <w:top w:val="none"/>
           <w:left w:val="none"/>
@@ -7532,6 +7572,7 @@
           <w:insideH w:val="none"/>
           <w:insideV w:val="none"/>
         </w:tblBorders>
+        <w:tblLook w:val="0000" w:firstRow="0" w:lastRow="0" w:firstColumn="0" w:lastColumn="0" w:noHBand="0" w:noVBand="0"/>
       </w:tblPr>
       <w:tblGrid>
         <w:gridCol w:w="4961"/>
@@ -7542,6 +7583,12 @@
           <w:tcPr>
             <w:tcW w:type="dxa" w:w="6690"/>
             <w:vAlign w:val="center"/>
+            <w:tcBorders>
+              <w:top w:val="none"/>
+              <w:left w:val="none"/>
+              <w:bottom w:val="none"/>
+              <w:right w:val="none"/>
+            </w:tcBorders>
           </w:tcPr>
           <w:p>
             <w:pPr>
@@ -7920,6 +7967,12 @@
           <w:tcPr>
             <w:tcW w:type="dxa" w:w="3231"/>
             <w:vAlign w:val="center"/>
+            <w:tcBorders>
+              <w:top w:val="none"/>
+              <w:left w:val="none"/>
+              <w:bottom w:val="none"/>
+              <w:right w:val="none"/>
+            </w:tcBorders>
           </w:tcPr>
           <w:p>
             <w:pPr>
@@ -9215,7 +9268,6 @@
       <w:tblPr>
         <w:tblW w:type="auto" w:w="0"/>
         <w:jc w:val="left"/>
-        <w:tblLook w:firstColumn="1" w:firstRow="1" w:lastColumn="0" w:lastRow="0" w:noHBand="0" w:noVBand="1" w:val="04A0"/>
         <w:tblBorders>
           <w:top w:val="none"/>
           <w:left w:val="none"/>
@@ -9224,6 +9276,7 @@
           <w:insideH w:val="none"/>
           <w:insideV w:val="none"/>
         </w:tblBorders>
+        <w:tblLook w:val="0000" w:firstRow="0" w:lastRow="0" w:firstColumn="0" w:lastColumn="0" w:noHBand="0" w:noVBand="0"/>
       </w:tblPr>
       <w:tblGrid>
         <w:gridCol w:w="1984"/>
@@ -9239,6 +9292,13 @@
         <w:tc>
           <w:tcPr>
             <w:tcW w:type="dxa" w:w="1020"/>
+            <w:vAlign w:val="center"/>
+            <w:tcBorders>
+              <w:top w:val="none"/>
+              <w:left w:val="none"/>
+              <w:bottom w:val="none"/>
+              <w:right w:val="none"/>
+            </w:tcBorders>
           </w:tcPr>
           <w:p>
             <w:pPr>
@@ -9266,6 +9326,7 @@
         <w:tc>
           <w:tcPr>
             <w:tcW w:type="dxa" w:w="369"/>
+            <w:vAlign w:val="center"/>
             <w:tcBorders>
               <w:top w:val="single" w:sz="8" w:space="0" w:color="000000"/>
               <w:left w:val="single" w:sz="8" w:space="0" w:color="000000"/>
@@ -9280,6 +9341,7 @@
         <w:tc>
           <w:tcPr>
             <w:tcW w:type="dxa" w:w="369"/>
+            <w:vAlign w:val="center"/>
             <w:tcBorders>
               <w:top w:val="single" w:sz="8" w:space="0" w:color="000000"/>
               <w:left w:val="single" w:sz="8" w:space="0" w:color="000000"/>
@@ -9294,6 +9356,7 @@
         <w:tc>
           <w:tcPr>
             <w:tcW w:type="dxa" w:w="369"/>
+            <w:vAlign w:val="center"/>
             <w:tcBorders>
               <w:top w:val="single" w:sz="8" w:space="0" w:color="000000"/>
               <w:left w:val="single" w:sz="8" w:space="0" w:color="000000"/>
@@ -9308,6 +9371,7 @@
         <w:tc>
           <w:tcPr>
             <w:tcW w:type="dxa" w:w="369"/>
+            <w:vAlign w:val="center"/>
             <w:tcBorders>
               <w:top w:val="single" w:sz="8" w:space="0" w:color="000000"/>
               <w:left w:val="single" w:sz="8" w:space="0" w:color="000000"/>
@@ -9325,7 +9389,6 @@
       <w:tblPr>
         <w:tblW w:type="auto" w:w="0"/>
         <w:jc w:val="center"/>
-        <w:tblLook w:firstColumn="1" w:firstRow="1" w:lastColumn="0" w:lastRow="0" w:noHBand="0" w:noVBand="1" w:val="04A0"/>
         <w:tblBorders>
           <w:top w:val="none"/>
           <w:left w:val="none"/>
@@ -9334,6 +9397,7 @@
           <w:insideH w:val="none"/>
           <w:insideV w:val="none"/>
         </w:tblBorders>
+        <w:tblLook w:val="0000" w:firstRow="0" w:lastRow="0" w:firstColumn="0" w:lastColumn="0" w:noHBand="0" w:noVBand="0"/>
       </w:tblPr>
       <w:tblGrid>
         <w:gridCol w:w="4961"/>
@@ -9344,6 +9408,12 @@
           <w:tcPr>
             <w:tcW w:type="dxa" w:w="6690"/>
             <w:vAlign w:val="center"/>
+            <w:tcBorders>
+              <w:top w:val="none"/>
+              <w:left w:val="none"/>
+              <w:bottom w:val="none"/>
+              <w:right w:val="none"/>
+            </w:tcBorders>
           </w:tcPr>
           <w:p>
             <w:pPr>
@@ -9440,7 +9510,6 @@
             <w:tblPr>
               <w:tblW w:type="auto" w:w="0"/>
               <w:jc w:val="left"/>
-              <w:tblLook w:firstColumn="1" w:firstRow="1" w:lastColumn="0" w:lastRow="0" w:noHBand="0" w:noVBand="1" w:val="04A0"/>
               <w:tblBorders>
                 <w:top w:val="none"/>
                 <w:left w:val="none"/>
@@ -9449,6 +9518,7 @@
                 <w:insideH w:val="none"/>
                 <w:insideV w:val="none"/>
               </w:tblBorders>
+              <w:tblLook w:val="0000" w:firstRow="0" w:lastRow="0" w:firstColumn="0" w:lastColumn="0" w:noHBand="0" w:noVBand="0"/>
             </w:tblPr>
             <w:tblGrid>
               <w:gridCol w:w="1984"/>
@@ -9464,6 +9534,13 @@
               <w:tc>
                 <w:tcPr>
                   <w:tcW w:type="dxa" w:w="1020"/>
+                  <w:vAlign w:val="center"/>
+                  <w:tcBorders>
+                    <w:top w:val="none"/>
+                    <w:left w:val="none"/>
+                    <w:bottom w:val="none"/>
+                    <w:right w:val="none"/>
+                  </w:tcBorders>
                 </w:tcPr>
                 <w:p>
                   <w:pPr>
@@ -9485,6 +9562,7 @@
               <w:tc>
                 <w:tcPr>
                   <w:tcW w:type="dxa" w:w="369"/>
+                  <w:vAlign w:val="center"/>
                   <w:tcBorders>
                     <w:top w:val="single" w:sz="8" w:space="0" w:color="000000"/>
                     <w:left w:val="single" w:sz="8" w:space="0" w:color="000000"/>
@@ -9497,6 +9575,7 @@
               <w:tc>
                 <w:tcPr>
                   <w:tcW w:type="dxa" w:w="369"/>
+                  <w:vAlign w:val="center"/>
                   <w:tcBorders>
                     <w:top w:val="single" w:sz="8" w:space="0" w:color="000000"/>
                     <w:left w:val="single" w:sz="8" w:space="0" w:color="000000"/>
@@ -9509,6 +9588,7 @@
               <w:tc>
                 <w:tcPr>
                   <w:tcW w:type="dxa" w:w="369"/>
+                  <w:vAlign w:val="center"/>
                   <w:tcBorders>
                     <w:top w:val="single" w:sz="8" w:space="0" w:color="000000"/>
                     <w:left w:val="single" w:sz="8" w:space="0" w:color="000000"/>
@@ -9521,6 +9601,7 @@
               <w:tc>
                 <w:tcPr>
                   <w:tcW w:type="dxa" w:w="369"/>
+                  <w:vAlign w:val="center"/>
                   <w:tcBorders>
                     <w:top w:val="single" w:sz="8" w:space="0" w:color="000000"/>
                     <w:left w:val="single" w:sz="8" w:space="0" w:color="000000"/>
@@ -9532,11 +9613,22 @@
               </w:tc>
             </w:tr>
           </w:tbl>
+          <w:p>
+            <w:pPr>
+              <w:spacing w:before="0" w:after="0" w:line="0" w:lineRule="auto"/>
+            </w:pPr>
+          </w:p>
         </w:tc>
         <w:tc>
           <w:tcPr>
             <w:tcW w:type="dxa" w:w="3231"/>
             <w:vAlign w:val="center"/>
+            <w:tcBorders>
+              <w:top w:val="none"/>
+              <w:left w:val="none"/>
+              <w:bottom w:val="none"/>
+              <w:right w:val="none"/>
+            </w:tcBorders>
           </w:tcPr>
           <w:p>
             <w:pPr>
@@ -10030,7 +10122,6 @@
       <w:tblPr>
         <w:tblW w:type="auto" w:w="0"/>
         <w:jc w:val="left"/>
-        <w:tblLook w:firstColumn="1" w:firstRow="1" w:lastColumn="0" w:lastRow="0" w:noHBand="0" w:noVBand="1" w:val="04A0"/>
         <w:tblBorders>
           <w:top w:val="none"/>
           <w:left w:val="none"/>
@@ -10039,6 +10130,7 @@
           <w:insideH w:val="none"/>
           <w:insideV w:val="none"/>
         </w:tblBorders>
+        <w:tblLook w:val="0000" w:firstRow="0" w:lastRow="0" w:firstColumn="0" w:lastColumn="0" w:noHBand="0" w:noVBand="0"/>
       </w:tblPr>
       <w:tblGrid>
         <w:gridCol w:w="1984"/>
@@ -10054,6 +10146,13 @@
         <w:tc>
           <w:tcPr>
             <w:tcW w:type="dxa" w:w="1020"/>
+            <w:vAlign w:val="center"/>
+            <w:tcBorders>
+              <w:top w:val="none"/>
+              <w:left w:val="none"/>
+              <w:bottom w:val="none"/>
+              <w:right w:val="none"/>
+            </w:tcBorders>
           </w:tcPr>
           <w:p>
             <w:pPr>
@@ -10081,6 +10180,7 @@
         <w:tc>
           <w:tcPr>
             <w:tcW w:type="dxa" w:w="369"/>
+            <w:vAlign w:val="center"/>
             <w:tcBorders>
               <w:top w:val="single" w:sz="8" w:space="0" w:color="000000"/>
               <w:left w:val="single" w:sz="8" w:space="0" w:color="000000"/>
@@ -10095,6 +10195,7 @@
         <w:tc>
           <w:tcPr>
             <w:tcW w:type="dxa" w:w="369"/>
+            <w:vAlign w:val="center"/>
             <w:tcBorders>
               <w:top w:val="single" w:sz="8" w:space="0" w:color="000000"/>
               <w:left w:val="single" w:sz="8" w:space="0" w:color="000000"/>
@@ -10109,6 +10210,7 @@
         <w:tc>
           <w:tcPr>
             <w:tcW w:type="dxa" w:w="369"/>
+            <w:vAlign w:val="center"/>
             <w:tcBorders>
               <w:top w:val="single" w:sz="8" w:space="0" w:color="000000"/>
               <w:left w:val="single" w:sz="8" w:space="0" w:color="000000"/>
@@ -10123,6 +10225,7 @@
         <w:tc>
           <w:tcPr>
             <w:tcW w:type="dxa" w:w="369"/>
+            <w:vAlign w:val="center"/>
             <w:tcBorders>
               <w:top w:val="single" w:sz="8" w:space="0" w:color="000000"/>
               <w:left w:val="single" w:sz="8" w:space="0" w:color="000000"/>
@@ -10525,7 +10628,6 @@
       <w:tblPr>
         <w:tblW w:type="auto" w:w="0"/>
         <w:jc w:val="left"/>
-        <w:tblLook w:firstColumn="1" w:firstRow="1" w:lastColumn="0" w:lastRow="0" w:noHBand="0" w:noVBand="1" w:val="04A0"/>
         <w:tblBorders>
           <w:top w:val="none"/>
           <w:left w:val="none"/>
@@ -10534,6 +10636,7 @@
           <w:insideH w:val="none"/>
           <w:insideV w:val="none"/>
         </w:tblBorders>
+        <w:tblLook w:val="0000" w:firstRow="0" w:lastRow="0" w:firstColumn="0" w:lastColumn="0" w:noHBand="0" w:noVBand="0"/>
       </w:tblPr>
       <w:tblGrid>
         <w:gridCol w:w="1984"/>
@@ -10549,6 +10652,13 @@
         <w:tc>
           <w:tcPr>
             <w:tcW w:type="dxa" w:w="1020"/>
+            <w:vAlign w:val="center"/>
+            <w:tcBorders>
+              <w:top w:val="none"/>
+              <w:left w:val="none"/>
+              <w:bottom w:val="none"/>
+              <w:right w:val="none"/>
+            </w:tcBorders>
           </w:tcPr>
           <w:p>
             <w:pPr>
@@ -10576,6 +10686,7 @@
         <w:tc>
           <w:tcPr>
             <w:tcW w:type="dxa" w:w="369"/>
+            <w:vAlign w:val="center"/>
             <w:tcBorders>
               <w:top w:val="single" w:sz="8" w:space="0" w:color="000000"/>
               <w:left w:val="single" w:sz="8" w:space="0" w:color="000000"/>
@@ -10590,6 +10701,7 @@
         <w:tc>
           <w:tcPr>
             <w:tcW w:type="dxa" w:w="369"/>
+            <w:vAlign w:val="center"/>
             <w:tcBorders>
               <w:top w:val="single" w:sz="8" w:space="0" w:color="000000"/>
               <w:left w:val="single" w:sz="8" w:space="0" w:color="000000"/>
@@ -10604,6 +10716,7 @@
         <w:tc>
           <w:tcPr>
             <w:tcW w:type="dxa" w:w="369"/>
+            <w:vAlign w:val="center"/>
             <w:tcBorders>
               <w:top w:val="single" w:sz="8" w:space="0" w:color="000000"/>
               <w:left w:val="single" w:sz="8" w:space="0" w:color="000000"/>
@@ -10618,6 +10731,7 @@
         <w:tc>
           <w:tcPr>
             <w:tcW w:type="dxa" w:w="369"/>
+            <w:vAlign w:val="center"/>
             <w:tcBorders>
               <w:top w:val="single" w:sz="8" w:space="0" w:color="000000"/>
               <w:left w:val="single" w:sz="8" w:space="0" w:color="000000"/>
@@ -11095,7 +11209,6 @@
       <w:tblPr>
         <w:tblW w:type="auto" w:w="0"/>
         <w:jc w:val="left"/>
-        <w:tblLook w:firstColumn="1" w:firstRow="1" w:lastColumn="0" w:lastRow="0" w:noHBand="0" w:noVBand="1" w:val="04A0"/>
         <w:tblBorders>
           <w:top w:val="none"/>
           <w:left w:val="none"/>
@@ -11104,6 +11217,7 @@
           <w:insideH w:val="none"/>
           <w:insideV w:val="none"/>
         </w:tblBorders>
+        <w:tblLook w:val="0000" w:firstRow="0" w:lastRow="0" w:firstColumn="0" w:lastColumn="0" w:noHBand="0" w:noVBand="0"/>
       </w:tblPr>
       <w:tblGrid>
         <w:gridCol w:w="1984"/>
@@ -11119,6 +11233,13 @@
         <w:tc>
           <w:tcPr>
             <w:tcW w:type="dxa" w:w="1020"/>
+            <w:vAlign w:val="center"/>
+            <w:tcBorders>
+              <w:top w:val="none"/>
+              <w:left w:val="none"/>
+              <w:bottom w:val="none"/>
+              <w:right w:val="none"/>
+            </w:tcBorders>
           </w:tcPr>
           <w:p>
             <w:pPr>
@@ -11146,6 +11267,7 @@
         <w:tc>
           <w:tcPr>
             <w:tcW w:type="dxa" w:w="369"/>
+            <w:vAlign w:val="center"/>
             <w:tcBorders>
               <w:top w:val="single" w:sz="8" w:space="0" w:color="000000"/>
               <w:left w:val="single" w:sz="8" w:space="0" w:color="000000"/>
@@ -11160,6 +11282,7 @@
         <w:tc>
           <w:tcPr>
             <w:tcW w:type="dxa" w:w="369"/>
+            <w:vAlign w:val="center"/>
             <w:tcBorders>
               <w:top w:val="single" w:sz="8" w:space="0" w:color="000000"/>
               <w:left w:val="single" w:sz="8" w:space="0" w:color="000000"/>
@@ -11174,6 +11297,7 @@
         <w:tc>
           <w:tcPr>
             <w:tcW w:type="dxa" w:w="369"/>
+            <w:vAlign w:val="center"/>
             <w:tcBorders>
               <w:top w:val="single" w:sz="8" w:space="0" w:color="000000"/>
               <w:left w:val="single" w:sz="8" w:space="0" w:color="000000"/>
@@ -11188,6 +11312,7 @@
         <w:tc>
           <w:tcPr>
             <w:tcW w:type="dxa" w:w="369"/>
+            <w:vAlign w:val="center"/>
             <w:tcBorders>
               <w:top w:val="single" w:sz="8" w:space="0" w:color="000000"/>
               <w:left w:val="single" w:sz="8" w:space="0" w:color="000000"/>
@@ -11645,7 +11770,6 @@
       <w:tblPr>
         <w:tblW w:type="auto" w:w="0"/>
         <w:jc w:val="left"/>
-        <w:tblLook w:firstColumn="1" w:firstRow="1" w:lastColumn="0" w:lastRow="0" w:noHBand="0" w:noVBand="1" w:val="04A0"/>
         <w:tblBorders>
           <w:top w:val="none"/>
           <w:left w:val="none"/>
@@ -11654,6 +11778,7 @@
           <w:insideH w:val="none"/>
           <w:insideV w:val="none"/>
         </w:tblBorders>
+        <w:tblLook w:val="0000" w:firstRow="0" w:lastRow="0" w:firstColumn="0" w:lastColumn="0" w:noHBand="0" w:noVBand="0"/>
       </w:tblPr>
       <w:tblGrid>
         <w:gridCol w:w="1984"/>
@@ -11669,6 +11794,13 @@
         <w:tc>
           <w:tcPr>
             <w:tcW w:type="dxa" w:w="1020"/>
+            <w:vAlign w:val="center"/>
+            <w:tcBorders>
+              <w:top w:val="none"/>
+              <w:left w:val="none"/>
+              <w:bottom w:val="none"/>
+              <w:right w:val="none"/>
+            </w:tcBorders>
           </w:tcPr>
           <w:p>
             <w:pPr>
@@ -11696,6 +11828,7 @@
         <w:tc>
           <w:tcPr>
             <w:tcW w:type="dxa" w:w="369"/>
+            <w:vAlign w:val="center"/>
             <w:tcBorders>
               <w:top w:val="single" w:sz="8" w:space="0" w:color="000000"/>
               <w:left w:val="single" w:sz="8" w:space="0" w:color="000000"/>
@@ -11710,6 +11843,7 @@
         <w:tc>
           <w:tcPr>
             <w:tcW w:type="dxa" w:w="369"/>
+            <w:vAlign w:val="center"/>
             <w:tcBorders>
               <w:top w:val="single" w:sz="8" w:space="0" w:color="000000"/>
               <w:left w:val="single" w:sz="8" w:space="0" w:color="000000"/>
@@ -11724,6 +11858,7 @@
         <w:tc>
           <w:tcPr>
             <w:tcW w:type="dxa" w:w="369"/>
+            <w:vAlign w:val="center"/>
             <w:tcBorders>
               <w:top w:val="single" w:sz="8" w:space="0" w:color="000000"/>
               <w:left w:val="single" w:sz="8" w:space="0" w:color="000000"/>
@@ -11738,6 +11873,7 @@
         <w:tc>
           <w:tcPr>
             <w:tcW w:type="dxa" w:w="369"/>
+            <w:vAlign w:val="center"/>
             <w:tcBorders>
               <w:top w:val="single" w:sz="8" w:space="0" w:color="000000"/>
               <w:left w:val="single" w:sz="8" w:space="0" w:color="000000"/>
@@ -12471,14 +12607,6 @@
         <w:right w:type="dxa" w:w="108"/>
       </w:tblCellMar>
     </w:tblPr>
-    <w:tblStylePr w:type="firstRow">
-      <w:tcPr>
-        <w:tcBorders>
-          <w:bottom w:val="single"/>
-        </w:tcBorders>
-        <w:vAlign w:val="bottom"/>
-      </w:tcPr>
-    </w:tblStylePr>
   </w:style>
   <w:style w:customStyle="1" w:styleId="DefinitionTerm" w:type="paragraph">
     <w:name w:val="Definition Term"/>

</xml_diff>